<commit_message>
Track the 09-02 drafts and the manuscript figure reorganisation
The 09-02 working draft and its ACS-formatted copy had never been committed --
their hand edits existed only on disk. Also captures the move of the FEP
schematic SVGs into post-feedback-from-atanu/figures/, the Figure-2 -> Fig2
re-export, and the current Figures.pptx and Supplementary Text.

Snapshotting the .docx files does not disturb them; it only records what is on
disk.
</commit_message>
<xml_diff>
--- a/manuscript/post-feedback-from-atanu/DorDRM-MD-08-26-26.docx
+++ b/manuscript/post-feedback-from-atanu/DorDRM-MD-08-26-26.docx
@@ -365,13 +365,7 @@
         <w:rPr>
           <w:rFonts w:ascii="Times New Roman" w:hAnsi="Times New Roman" w:cs="Times New Roman"/>
         </w:rPr>
-        <w:t xml:space="preserve">Among genotypes with established susceptible or resistant phenotypes, a weak association </w:t>
-      </w:r>
-      <w:r>
-        <w:rPr>
-          <w:rFonts w:ascii="Times New Roman" w:hAnsi="Times New Roman" w:cs="Times New Roman"/>
-        </w:rPr>
-        <w:t xml:space="preserve">between relative change in binding free energy, </w:t>
+        <w:t xml:space="preserve">Among genotypes with established susceptible or resistant phenotypes, a weak association between relative change in binding free energy, </w:t>
       </w:r>
       <w:proofErr w:type="spellStart"/>
       <w:r>
@@ -392,13 +386,7 @@
         <w:rPr>
           <w:rFonts w:ascii="Times New Roman" w:hAnsi="Times New Roman" w:cs="Times New Roman"/>
         </w:rPr>
-        <w:t xml:space="preserve">, and </w:t>
-      </w:r>
-      <w:r>
-        <w:rPr>
-          <w:rFonts w:ascii="Times New Roman" w:hAnsi="Times New Roman" w:cs="Times New Roman"/>
-        </w:rPr>
-        <w:t>with log</w:t>
+        <w:t>, and with log</w:t>
       </w:r>
       <w:r>
         <w:rPr>
@@ -1754,13 +1742,7 @@
         <w:rPr>
           <w:rFonts w:ascii="Times New Roman" w:hAnsi="Times New Roman" w:cs="Times New Roman"/>
         </w:rPr>
-        <w:t xml:space="preserve"> </w:t>
-      </w:r>
-      <w:r>
-        <w:rPr>
-          <w:rFonts w:ascii="Times New Roman" w:hAnsi="Times New Roman" w:cs="Times New Roman"/>
-        </w:rPr>
-        <w:t xml:space="preserve">Whether computed binding free energies track phenotypic susceptibility across a panel </w:t>
+        <w:t xml:space="preserve"> Whether computed binding free energies track phenotypic susceptibility across a panel </w:t>
       </w:r>
       <w:r>
         <w:rPr>
@@ -3107,14 +3089,7 @@
           <w:rFonts w:ascii="Times New Roman" w:hAnsi="Times New Roman" w:cs="Times New Roman"/>
           <w:szCs w:val="24"/>
         </w:rPr>
-        <w:t xml:space="preserve"> ring.</w:t>
-      </w:r>
-      <w:r>
-        <w:rPr>
-          <w:rFonts w:ascii="Times New Roman" w:hAnsi="Times New Roman" w:cs="Times New Roman"/>
-          <w:szCs w:val="24"/>
-        </w:rPr>
-        <w:t xml:space="preserve"> </w:t>
+        <w:t xml:space="preserve"> ring. </w:t>
       </w:r>
     </w:p>
     <w:p>
@@ -3565,14 +3540,7 @@
           <w:rFonts w:ascii="Times New Roman" w:hAnsi="Times New Roman" w:cs="Times New Roman"/>
           <w:szCs w:val="24"/>
         </w:rPr>
-        <w:t xml:space="preserve">Here, </w:t>
-      </w:r>
-      <w:r>
-        <w:rPr>
-          <w:rFonts w:ascii="Times New Roman" w:hAnsi="Times New Roman" w:cs="Times New Roman"/>
-          <w:szCs w:val="24"/>
-        </w:rPr>
-        <w:t>∆</w:t>
+        <w:t>Here, ∆</w:t>
       </w:r>
       <w:proofErr w:type="spellStart"/>
       <w:r>
@@ -3627,21 +3595,7 @@
           <w:rFonts w:ascii="Times New Roman" w:hAnsi="Times New Roman" w:cs="Times New Roman"/>
           <w:szCs w:val="24"/>
         </w:rPr>
-        <w:t xml:space="preserve"> </w:t>
-      </w:r>
-      <w:r>
-        <w:rPr>
-          <w:rFonts w:ascii="Times New Roman" w:hAnsi="Times New Roman" w:cs="Times New Roman"/>
-          <w:szCs w:val="24"/>
-        </w:rPr>
-        <w:t>evaluated by selectively zeroing the complementary nonbonded parameters</w:t>
-      </w:r>
-      <w:r>
-        <w:rPr>
-          <w:rFonts w:ascii="Times New Roman" w:hAnsi="Times New Roman" w:cs="Times New Roman"/>
-          <w:szCs w:val="24"/>
-        </w:rPr>
-        <w:t>.</w:t>
+        <w:t xml:space="preserve"> evaluated by selectively zeroing the complementary nonbonded parameters.</w:t>
       </w:r>
       <w:r>
         <w:rPr>
@@ -4096,16 +4050,7 @@
             <w:rPr>
               <w:rFonts w:ascii="Cambria Math" w:hAnsi="Cambria Math"/>
             </w:rPr>
-            <m:t>DO</m:t>
-          </m:r>
-          <m:r>
-            <m:rPr>
-              <m:sty m:val="p"/>
-            </m:rPr>
-            <w:rPr>
-              <w:rFonts w:ascii="Cambria Math" w:hAnsi="Cambria Math"/>
-            </w:rPr>
-            <m:t>R</m:t>
+            <m:t>DOR</m:t>
           </m:r>
         </m:oMath>
       </m:oMathPara>
@@ -4116,10 +4061,7 @@
         <w:spacing w:before="0" w:beforeAutospacing="0"/>
       </w:pPr>
       <w:r>
-        <w:t>However, d</w:t>
-      </w:r>
-      <w:r>
-        <w:t>irect calculation of ∆</w:t>
+        <w:t>However, direct calculation of ∆</w:t>
       </w:r>
       <w:proofErr w:type="spellStart"/>
       <w:r>
@@ -4133,19 +4075,7 @@
       </w:r>
       <w:proofErr w:type="spellEnd"/>
       <w:r>
-        <w:t xml:space="preserve"> is </w:t>
-      </w:r>
-      <w:r>
-        <w:t>computationally</w:t>
-      </w:r>
-      <w:r>
-        <w:t xml:space="preserve"> </w:t>
-      </w:r>
-      <w:r>
-        <w:t>expensive</w:t>
-      </w:r>
-      <w:r>
-        <w:t>. Because G is a state function</w:t>
+        <w:t xml:space="preserve"> is computationally expensive. Because G is a state function</w:t>
       </w:r>
       <w:r>
         <w:t xml:space="preserve">, the change in DOR binding free energy was computed from a thermodynamic cycle in which the p66 substitution was introduced alchemically in both the DOR-bound and the ligand-free enzyme, </w:t>
@@ -5044,13 +4974,7 @@
         <w:t>p</w:t>
       </w:r>
       <w:r>
-        <w:t xml:space="preserve">, </w:t>
-      </w:r>
-      <w:r>
-        <w:t>λ</w:t>
-      </w:r>
-      <w:r>
-        <w:t>)</w:t>
+        <w:t>, λ)</w:t>
       </w:r>
       <w:r>
         <w:rPr>
@@ -5060,13 +4984,7 @@
         <w:t xml:space="preserve"> </w:t>
       </w:r>
       <w:r>
-        <w:t xml:space="preserve">the Hamiltonian of the system at coupling parameter </w:t>
-      </w:r>
-      <w:r>
-        <w:t>λ</w:t>
-      </w:r>
-      <w:r>
-        <w:t xml:space="preserve">. </w:t>
+        <w:t xml:space="preserve">the Hamiltonian of the system at coupling parameter λ. </w:t>
       </w:r>
       <w:r>
         <w:t xml:space="preserve">Wild-type and mutant end states were connected by </w:t>
@@ -5342,25 +5260,7 @@
         <w:spacing w:before="0" w:beforeAutospacing="0"/>
       </w:pPr>
       <w:r>
-        <w:t xml:space="preserve">with </w:t>
-      </w:r>
-      <w:r>
-        <w:t>λ = 0</w:t>
-      </w:r>
-      <w:r>
-        <w:t xml:space="preserve"> the</w:t>
-      </w:r>
-      <w:r>
-        <w:t xml:space="preserve"> wild type</w:t>
-      </w:r>
-      <w:r>
-        <w:t xml:space="preserve"> and</w:t>
-      </w:r>
-      <w:r>
-        <w:t xml:space="preserve"> λ = 1</w:t>
-      </w:r>
-      <w:r>
-        <w:t xml:space="preserve"> the mutant residue. </w:t>
+        <w:t xml:space="preserve">with λ = 0 the wild type and λ = 1 the mutant residue. </w:t>
       </w:r>
       <w:r>
         <w:t>Hybrid systems were built in GROMACS 2023.1,</w:t>
@@ -5480,10 +5380,7 @@
       </w:r>
       <w:proofErr w:type="spellEnd"/>
       <w:r>
-        <w:t>; each seeded an independent simulation in which λ was driven linearly to the opposite end state, giving 100 forward and 100 reverse work values per phase per replicate.</w:t>
-      </w:r>
-      <w:r>
-        <w:t xml:space="preserve"> The work accumulated along each switch is</w:t>
+        <w:t>; each seeded an independent simulation in which λ was driven linearly to the opposite end state, giving 100 forward and 100 reverse work values per phase per replicate. The work accumulated along each switch is</w:t>
       </w:r>
     </w:p>
     <w:p>
@@ -12292,31 +12189,7 @@
         <w:rPr>
           <w:rFonts w:ascii="Times New Roman" w:hAnsi="Times New Roman" w:cs="Times New Roman"/>
         </w:rPr>
-        <w:t>K103N+M230L is the only genotype for which the</w:t>
-      </w:r>
-      <w:r>
-        <w:rPr>
-          <w:rFonts w:ascii="Times New Roman" w:hAnsi="Times New Roman" w:cs="Times New Roman"/>
-        </w:rPr>
-        <w:t xml:space="preserve"> net</w:t>
-      </w:r>
-      <w:r>
-        <w:rPr>
-          <w:rFonts w:ascii="Times New Roman" w:hAnsi="Times New Roman" w:cs="Times New Roman"/>
-        </w:rPr>
-        <w:t xml:space="preserve"> interface energy </w:t>
-      </w:r>
-      <w:r>
-        <w:rPr>
-          <w:rFonts w:ascii="Times New Roman" w:hAnsi="Times New Roman" w:cs="Times New Roman"/>
-        </w:rPr>
-        <w:t>was negative</w:t>
-      </w:r>
-      <w:r>
-        <w:rPr>
-          <w:rFonts w:ascii="Times New Roman" w:hAnsi="Times New Roman" w:cs="Times New Roman"/>
-        </w:rPr>
-        <w:t xml:space="preserve"> (∆∆</w:t>
+        <w:t>K103N+M230L is the only genotype for which the net interface energy was negative (∆∆</w:t>
       </w:r>
       <w:proofErr w:type="spellStart"/>
       <w:r>
@@ -12337,19 +12210,7 @@
         <w:rPr>
           <w:rFonts w:ascii="Times New Roman" w:hAnsi="Times New Roman" w:cs="Times New Roman"/>
         </w:rPr>
-        <w:t xml:space="preserve"> = −1.13 ± 1.26 kcal/mol), while A98G+F227C (1.09 ± 1.35 kcal/mol) and V106A+P225H (1.16 ± 0.86 kcal/mol) are positive but not resolved above the </w:t>
-      </w:r>
-      <w:r>
-        <w:rPr>
-          <w:rFonts w:ascii="Times New Roman" w:hAnsi="Times New Roman" w:cs="Times New Roman"/>
-        </w:rPr>
-        <w:t xml:space="preserve">0.5kcal/mol </w:t>
-      </w:r>
-      <w:r>
-        <w:rPr>
-          <w:rFonts w:ascii="Times New Roman" w:hAnsi="Times New Roman" w:cs="Times New Roman"/>
-        </w:rPr>
-        <w:t xml:space="preserve">threshold. </w:t>
+        <w:t xml:space="preserve"> = −1.13 ± 1.26 kcal/mol), while A98G+F227C (1.09 ± 1.35 kcal/mol) and V106A+P225H (1.16 ± 0.86 kcal/mol) are positive but not resolved above the 0.5kcal/mol threshold. </w:t>
       </w:r>
       <w:r>
         <w:rPr>
@@ -17169,15 +17030,7 @@
           <w:sz w:val="20"/>
           <w:szCs w:val="20"/>
         </w:rPr>
-        <w:t>, relative DOR binding free energy between mutant and WT RT. For all quantities, positive values indicate a less favorable contribution to DOR binding relative to WT</w:t>
-      </w:r>
-      <w:r>
-        <w:rPr>
-          <w:rFonts w:ascii="Times New Roman" w:hAnsi="Times New Roman" w:cs="Times New Roman"/>
-          <w:sz w:val="20"/>
-          <w:szCs w:val="20"/>
-        </w:rPr>
-        <w:t>.</w:t>
+        <w:t>, relative DOR binding free energy between mutant and WT RT. For all quantities, positive values indicate a less favorable contribution to DOR binding relative to WT.</w:t>
       </w:r>
     </w:p>
     <w:p>
@@ -17677,6 +17530,14 @@
           <w:sz w:val="22"/>
           <w:szCs w:val="22"/>
         </w:rPr>
+        <w:t xml:space="preserve"> Figure 3: Trajectory-level evidence for two distinct resistance mechanisms.</w:t>
+      </w:r>
+      <w:r>
+        <w:rPr>
+          <w:rFonts w:ascii="Times New Roman" w:hAnsi="Times New Roman" w:cs="Times New Roman"/>
+          <w:sz w:val="22"/>
+          <w:szCs w:val="22"/>
+        </w:rPr>
         <w:t xml:space="preserve"> </w:t>
       </w:r>
       <w:r>
@@ -17687,7 +17548,33 @@
           <w:sz w:val="22"/>
           <w:szCs w:val="22"/>
         </w:rPr>
-        <w:t xml:space="preserve">Figure </w:t>
+        <w:t>(A)</w:t>
+      </w:r>
+      <w:r>
+        <w:rPr>
+          <w:rFonts w:ascii="Times New Roman" w:hAnsi="Times New Roman" w:cs="Times New Roman"/>
+          <w:sz w:val="22"/>
+          <w:szCs w:val="22"/>
+        </w:rPr>
+        <w:t xml:space="preserve"> Burial of the DOR </w:t>
+      </w:r>
+      <w:proofErr w:type="spellStart"/>
+      <w:r>
+        <w:rPr>
+          <w:rFonts w:ascii="Times New Roman" w:hAnsi="Times New Roman" w:cs="Times New Roman"/>
+          <w:sz w:val="22"/>
+          <w:szCs w:val="22"/>
+        </w:rPr>
+        <w:t>chlorocyanophenyl</w:t>
+      </w:r>
+      <w:proofErr w:type="spellEnd"/>
+      <w:r>
+        <w:rPr>
+          <w:rFonts w:ascii="Times New Roman" w:hAnsi="Times New Roman" w:cs="Times New Roman"/>
+          <w:sz w:val="22"/>
+          <w:szCs w:val="22"/>
+        </w:rPr>
+        <w:t xml:space="preserve"> ring, defined as the number of protein heavy atoms within 4.5 Å of the ring, for WT and Y188L. </w:t>
       </w:r>
       <w:r>
         <w:rPr>
@@ -17697,123 +17584,15 @@
           <w:sz w:val="22"/>
           <w:szCs w:val="22"/>
         </w:rPr>
-        <w:t>3</w:t>
-      </w:r>
-      <w:r>
-        <w:rPr>
-          <w:rFonts w:ascii="Times New Roman" w:hAnsi="Times New Roman" w:cs="Times New Roman"/>
-          <w:b/>
-          <w:bCs/>
+        <w:t xml:space="preserve">(B) </w:t>
+      </w:r>
+      <w:r>
+        <w:rPr>
+          <w:rFonts w:ascii="Times New Roman" w:hAnsi="Times New Roman" w:cs="Times New Roman"/>
           <w:sz w:val="22"/>
           <w:szCs w:val="22"/>
         </w:rPr>
-        <w:t xml:space="preserve">: </w:t>
-      </w:r>
-      <w:r>
-        <w:rPr>
-          <w:rFonts w:ascii="Times New Roman" w:hAnsi="Times New Roman" w:cs="Times New Roman"/>
-          <w:b/>
-          <w:bCs/>
-          <w:sz w:val="22"/>
-          <w:szCs w:val="22"/>
-        </w:rPr>
-        <w:t>Trajectory-level evidence for two distinct resistance mechanisms</w:t>
-      </w:r>
-      <w:r>
-        <w:rPr>
-          <w:rFonts w:ascii="Times New Roman" w:hAnsi="Times New Roman" w:cs="Times New Roman"/>
-          <w:b/>
-          <w:bCs/>
-          <w:sz w:val="22"/>
-          <w:szCs w:val="22"/>
-        </w:rPr>
-        <w:t>.</w:t>
-      </w:r>
-      <w:r>
-        <w:rPr>
-          <w:rFonts w:ascii="Times New Roman" w:hAnsi="Times New Roman" w:cs="Times New Roman"/>
-          <w:sz w:val="22"/>
-          <w:szCs w:val="22"/>
-        </w:rPr>
-        <w:t xml:space="preserve"> </w:t>
-      </w:r>
-      <w:r>
-        <w:rPr>
-          <w:rFonts w:ascii="Times New Roman" w:hAnsi="Times New Roman" w:cs="Times New Roman"/>
-          <w:b/>
-          <w:bCs/>
-          <w:sz w:val="22"/>
-          <w:szCs w:val="22"/>
-        </w:rPr>
-        <w:t>(A)</w:t>
-      </w:r>
-      <w:r>
-        <w:rPr>
-          <w:rFonts w:ascii="Times New Roman" w:hAnsi="Times New Roman" w:cs="Times New Roman"/>
-          <w:sz w:val="22"/>
-          <w:szCs w:val="22"/>
-        </w:rPr>
-        <w:t xml:space="preserve"> Burial of the DOR </w:t>
-      </w:r>
-      <w:proofErr w:type="spellStart"/>
-      <w:r>
-        <w:rPr>
-          <w:rFonts w:ascii="Times New Roman" w:hAnsi="Times New Roman" w:cs="Times New Roman"/>
-          <w:sz w:val="22"/>
-          <w:szCs w:val="22"/>
-        </w:rPr>
-        <w:t>chlorocyanophenyl</w:t>
-      </w:r>
-      <w:proofErr w:type="spellEnd"/>
-      <w:r>
-        <w:rPr>
-          <w:rFonts w:ascii="Times New Roman" w:hAnsi="Times New Roman" w:cs="Times New Roman"/>
-          <w:sz w:val="22"/>
-          <w:szCs w:val="22"/>
-        </w:rPr>
-        <w:t xml:space="preserve"> ring, defined as the number of protein heavy atoms within 4.5 Å of the ring, for WT and Y188L.</w:t>
-      </w:r>
-      <w:r>
-        <w:rPr>
-          <w:rFonts w:ascii="Times New Roman" w:hAnsi="Times New Roman" w:cs="Times New Roman"/>
-          <w:sz w:val="22"/>
-          <w:szCs w:val="22"/>
-        </w:rPr>
-        <w:t xml:space="preserve"> </w:t>
-      </w:r>
-      <w:r>
-        <w:rPr>
-          <w:rFonts w:ascii="Times New Roman" w:hAnsi="Times New Roman" w:cs="Times New Roman"/>
-          <w:b/>
-          <w:bCs/>
-          <w:sz w:val="22"/>
-          <w:szCs w:val="22"/>
-        </w:rPr>
-        <w:t xml:space="preserve">(B) </w:t>
-      </w:r>
-      <w:r>
-        <w:rPr>
-          <w:rFonts w:ascii="Times New Roman" w:hAnsi="Times New Roman" w:cs="Times New Roman"/>
-          <w:sz w:val="22"/>
-          <w:szCs w:val="22"/>
-        </w:rPr>
-        <w:t>Displacement of DOR toward Ser105, defined as the minimum heavy-atom distance between DOR and the Ser105 side chain, for WT and the four V106A-containing genotypes</w:t>
-      </w:r>
-      <w:r>
-        <w:rPr>
-          <w:rFonts w:ascii="Times New Roman" w:hAnsi="Times New Roman" w:cs="Times New Roman"/>
-          <w:sz w:val="22"/>
-          <w:szCs w:val="22"/>
-        </w:rPr>
-        <w:t xml:space="preserve"> (cf. Table 2)</w:t>
-      </w:r>
-      <w:r>
-        <w:rPr>
-          <w:rFonts w:ascii="Times New Roman" w:hAnsi="Times New Roman" w:cs="Times New Roman"/>
-          <w:sz w:val="22"/>
-          <w:szCs w:val="22"/>
-        </w:rPr>
-        <w:t>. Solid lines are means over three independent 100 ns replicates interpolated onto a common time grid; shading is the standard error of the mean across replicates.</w:t>
+        <w:t>Displacement of DOR toward Ser105, defined as the minimum heavy-atom distance between DOR and the Ser105 side chain, for WT and the four V106A-containing genotypes (cf. Table 2). Solid lines are means over three independent 100 ns replicates interpolated onto a common time grid; shading is the standard error of the mean across replicates.</w:t>
       </w:r>
     </w:p>
     <w:p>
@@ -17829,35 +17608,7 @@
           <w:rFonts w:ascii="Times New Roman" w:hAnsi="Times New Roman" w:cs="Times New Roman"/>
           <w:szCs w:val="24"/>
         </w:rPr>
-        <w:t>In WT simulations</w:t>
-      </w:r>
-      <w:r>
-        <w:rPr>
-          <w:rFonts w:ascii="Times New Roman" w:hAnsi="Times New Roman" w:cs="Times New Roman"/>
-          <w:szCs w:val="24"/>
-        </w:rPr>
-        <w:t xml:space="preserve">, </w:t>
-      </w:r>
-      <w:r>
-        <w:rPr>
-          <w:rFonts w:ascii="Times New Roman" w:hAnsi="Times New Roman" w:cs="Times New Roman"/>
-          <w:szCs w:val="24"/>
-        </w:rPr>
-        <w:t xml:space="preserve">the Tyr188 </w:t>
-      </w:r>
-      <w:r>
-        <w:rPr>
-          <w:rFonts w:ascii="Times New Roman" w:hAnsi="Times New Roman" w:cs="Times New Roman"/>
-          <w:szCs w:val="24"/>
-        </w:rPr>
-        <w:t xml:space="preserve">phenyl </w:t>
-      </w:r>
-      <w:r>
-        <w:rPr>
-          <w:rFonts w:ascii="Times New Roman" w:hAnsi="Times New Roman" w:cs="Times New Roman"/>
-          <w:szCs w:val="24"/>
-        </w:rPr>
-        <w:t xml:space="preserve">ring remained stacked against the </w:t>
+        <w:t xml:space="preserve">In WT simulations, the Tyr188 phenyl ring remained stacked against the </w:t>
       </w:r>
       <w:proofErr w:type="spellStart"/>
       <w:r>
@@ -17873,14 +17624,7 @@
           <w:rFonts w:ascii="Times New Roman" w:hAnsi="Times New Roman" w:cs="Times New Roman"/>
           <w:szCs w:val="24"/>
         </w:rPr>
-        <w:t xml:space="preserve"> ring of DOR at a centroid separation of 4.2 Å and an interplanar angle of 13°, close to the 3.8 Å observed in </w:t>
-      </w:r>
-      <w:r>
-        <w:rPr>
-          <w:rFonts w:ascii="Times New Roman" w:hAnsi="Times New Roman" w:cs="Times New Roman"/>
-          <w:szCs w:val="24"/>
-        </w:rPr>
-        <w:t>the crystal structure.</w:t>
+        <w:t xml:space="preserve"> ring of DOR at a centroid separation of 4.2 Å and an interplanar angle of 13°, close to the 3.8 Å observed in the crystal structure.</w:t>
       </w:r>
       <w:r>
         <w:rPr>
@@ -17893,35 +17637,7 @@
           <w:rFonts w:ascii="Times New Roman" w:hAnsi="Times New Roman" w:cs="Times New Roman"/>
           <w:szCs w:val="24"/>
         </w:rPr>
-        <w:t xml:space="preserve">Y188L removes this stacking partner, </w:t>
-      </w:r>
-      <w:r>
-        <w:rPr>
-          <w:rFonts w:ascii="Times New Roman" w:hAnsi="Times New Roman" w:cs="Times New Roman"/>
-          <w:szCs w:val="24"/>
-        </w:rPr>
-        <w:t xml:space="preserve">illustrated by </w:t>
-      </w:r>
-      <w:r>
-        <w:rPr>
-          <w:rFonts w:ascii="Times New Roman" w:hAnsi="Times New Roman" w:cs="Times New Roman"/>
-          <w:szCs w:val="24"/>
-        </w:rPr>
-        <w:t xml:space="preserve">the number of </w:t>
-      </w:r>
-      <w:r>
-        <w:rPr>
-          <w:rFonts w:ascii="Times New Roman" w:hAnsi="Times New Roman" w:cs="Times New Roman"/>
-          <w:szCs w:val="24"/>
-        </w:rPr>
-        <w:t>RT</w:t>
-      </w:r>
-      <w:r>
-        <w:rPr>
-          <w:rFonts w:ascii="Times New Roman" w:hAnsi="Times New Roman" w:cs="Times New Roman"/>
-          <w:szCs w:val="24"/>
-        </w:rPr>
-        <w:t xml:space="preserve"> heavy atoms within 4.5 Å of the </w:t>
+        <w:t xml:space="preserve">Y188L removes this stacking partner, illustrated by the number of RT heavy atoms within 4.5 Å of the </w:t>
       </w:r>
       <w:proofErr w:type="spellStart"/>
       <w:r>
@@ -17937,21 +17653,7 @@
           <w:rFonts w:ascii="Times New Roman" w:hAnsi="Times New Roman" w:cs="Times New Roman"/>
           <w:szCs w:val="24"/>
         </w:rPr>
-        <w:t xml:space="preserve"> ring f</w:t>
-      </w:r>
-      <w:r>
-        <w:rPr>
-          <w:rFonts w:ascii="Times New Roman" w:hAnsi="Times New Roman" w:cs="Times New Roman"/>
-          <w:szCs w:val="24"/>
-        </w:rPr>
-        <w:t>alling</w:t>
-      </w:r>
-      <w:r>
-        <w:rPr>
-          <w:rFonts w:ascii="Times New Roman" w:hAnsi="Times New Roman" w:cs="Times New Roman"/>
-          <w:szCs w:val="24"/>
-        </w:rPr>
-        <w:t xml:space="preserve"> from 45.3 ± 2.4 in WT to 34.2 ± 1.1 in Y188L (Figure 3A), a loss of roughly a quarter of the packing around this ring.</w:t>
+        <w:t xml:space="preserve"> ring falling from 45.3 ± 2.4 in WT to 34.2 ± 1.1 in Y188L (Figure 3A), a loss of roughly a quarter of the packing around this ring.</w:t>
       </w:r>
       <w:r>
         <w:rPr>
@@ -17965,28 +17667,7 @@
           <w:rFonts w:ascii="Times New Roman" w:hAnsi="Times New Roman" w:cs="Times New Roman"/>
           <w:szCs w:val="24"/>
         </w:rPr>
-        <w:t xml:space="preserve"> relative to WT trajectories, </w:t>
-      </w:r>
-      <w:r>
-        <w:rPr>
-          <w:rFonts w:ascii="Times New Roman" w:hAnsi="Times New Roman" w:cs="Times New Roman"/>
-          <w:szCs w:val="24"/>
-        </w:rPr>
-        <w:t>DOR moved toward Ser105, the distance falling from 6.61 ± 0.13 Å in WT to 5.32 ± 0.03 Å in V106A, 5.28 ± 0.06 Å in V106A+F227L, 5.09 ± 0.10 Å in V106A+L234I and 5.19 ± 0.08 Å in V106A+P225H (Figure 3B).</w:t>
-      </w:r>
-      <w:r>
-        <w:rPr>
-          <w:rFonts w:ascii="Times New Roman" w:hAnsi="Times New Roman" w:cs="Times New Roman"/>
-          <w:szCs w:val="24"/>
-        </w:rPr>
-        <w:t xml:space="preserve"> This dislocation disrupts contacts with RT residues, for example </w:t>
-      </w:r>
-      <w:r>
-        <w:rPr>
-          <w:rFonts w:ascii="Times New Roman" w:hAnsi="Times New Roman" w:cs="Times New Roman"/>
-          <w:szCs w:val="24"/>
-        </w:rPr>
-        <w:t>the total number of protein heavy atoms within 4.5 Å of DOR fell from 224 ± 1 in WT to 212 ± 1 in V106A.</w:t>
+        <w:t xml:space="preserve"> relative to WT trajectories, DOR moved toward Ser105, the distance falling from 6.61 ± 0.13 Å in WT to 5.32 ± 0.03 Å in V106A, 5.28 ± 0.06 Å in V106A+F227L, 5.09 ± 0.10 Å in V106A+L234I and 5.19 ± 0.08 Å in V106A+P225H (Figure 3B). This dislocation disrupts contacts with RT residues, for example the total number of protein heavy atoms within 4.5 Å of DOR fell from 224 ± 1 in WT to 212 ± 1 in V106A.</w:t>
       </w:r>
       <w:r>
         <w:rPr>
@@ -18859,33 +18540,64 @@
         <w:rPr>
           <w:rFonts w:ascii="Times New Roman" w:hAnsi="Times New Roman" w:cs="Times New Roman"/>
         </w:rPr>
+        <w:t xml:space="preserve"> (∆∆</w:t>
+      </w:r>
+      <w:proofErr w:type="spellStart"/>
+      <w:r>
+        <w:rPr>
+          <w:rFonts w:ascii="Times New Roman" w:hAnsi="Times New Roman" w:cs="Times New Roman"/>
+        </w:rPr>
+        <w:t>E</w:t>
+      </w:r>
+      <w:r>
+        <w:rPr>
+          <w:rFonts w:ascii="Times New Roman" w:hAnsi="Times New Roman" w:cs="Times New Roman"/>
+          <w:vertAlign w:val="subscript"/>
+        </w:rPr>
+        <w:t>vdW</w:t>
+      </w:r>
+      <w:proofErr w:type="spellEnd"/>
+      <w:r>
+        <w:rPr>
+          <w:rFonts w:ascii="Times New Roman" w:hAnsi="Times New Roman" w:cs="Times New Roman"/>
+          <w:vertAlign w:val="subscript"/>
+        </w:rPr>
         <w:t xml:space="preserve"> </w:t>
       </w:r>
       <w:r>
         <w:rPr>
           <w:rFonts w:ascii="Times New Roman" w:hAnsi="Times New Roman" w:cs="Times New Roman"/>
         </w:rPr>
-        <w:t>(∆∆</w:t>
-      </w:r>
-      <w:proofErr w:type="spellStart"/>
-      <w:r>
-        <w:rPr>
-          <w:rFonts w:ascii="Times New Roman" w:hAnsi="Times New Roman" w:cs="Times New Roman"/>
-        </w:rPr>
-        <w:t>E</w:t>
+        <w:t xml:space="preserve">= 3.93 ± 1.39 kcal/mol) and the largest binding free energy </w:t>
+      </w:r>
+      <w:r>
+        <w:rPr>
+          <w:rFonts w:ascii="Times New Roman" w:hAnsi="Times New Roman" w:cs="Times New Roman"/>
+        </w:rPr>
+        <w:t xml:space="preserve">penalty </w:t>
+      </w:r>
+      <w:r>
+        <w:rPr>
+          <w:rFonts w:ascii="Times New Roman" w:hAnsi="Times New Roman" w:cs="Times New Roman"/>
+        </w:rPr>
+        <w:t>(∆∆G</w:t>
       </w:r>
       <w:r>
         <w:rPr>
           <w:rFonts w:ascii="Times New Roman" w:hAnsi="Times New Roman" w:cs="Times New Roman"/>
           <w:vertAlign w:val="subscript"/>
         </w:rPr>
-        <w:t>vdW</w:t>
-      </w:r>
-      <w:proofErr w:type="spellEnd"/>
-      <w:r>
-        <w:rPr>
-          <w:rFonts w:ascii="Times New Roman" w:hAnsi="Times New Roman" w:cs="Times New Roman"/>
-          <w:vertAlign w:val="subscript"/>
+        <w:t>bind</w:t>
+      </w:r>
+      <w:r>
+        <w:rPr>
+          <w:rFonts w:ascii="Times New Roman" w:hAnsi="Times New Roman" w:cs="Times New Roman"/>
+        </w:rPr>
+        <w:t xml:space="preserve"> = 4.52 ± 0.49 kcal/mol) of any Resistant genotype</w:t>
+      </w:r>
+      <w:r>
+        <w:rPr>
+          <w:rFonts w:ascii="Times New Roman" w:hAnsi="Times New Roman" w:cs="Times New Roman"/>
         </w:rPr>
         <w:t xml:space="preserve"> </w:t>
       </w:r>
@@ -18893,69 +18605,6 @@
         <w:rPr>
           <w:rFonts w:ascii="Times New Roman" w:hAnsi="Times New Roman" w:cs="Times New Roman"/>
         </w:rPr>
-        <w:t>= 3.93 ± 1.39 kcal/mol)</w:t>
-      </w:r>
-      <w:r>
-        <w:rPr>
-          <w:rFonts w:ascii="Times New Roman" w:hAnsi="Times New Roman" w:cs="Times New Roman"/>
-        </w:rPr>
-        <w:t xml:space="preserve"> and the largest binding free energy (∆∆</w:t>
-      </w:r>
-      <w:proofErr w:type="spellStart"/>
-      <w:r>
-        <w:rPr>
-          <w:rFonts w:ascii="Times New Roman" w:hAnsi="Times New Roman" w:cs="Times New Roman"/>
-        </w:rPr>
-        <w:t>G</w:t>
-      </w:r>
-      <w:r>
-        <w:rPr>
-          <w:rFonts w:ascii="Times New Roman" w:hAnsi="Times New Roman" w:cs="Times New Roman"/>
-          <w:vertAlign w:val="subscript"/>
-        </w:rPr>
-        <w:t>bind</w:t>
-      </w:r>
-      <w:proofErr w:type="spellEnd"/>
-      <w:r>
-        <w:rPr>
-          <w:rFonts w:ascii="Times New Roman" w:hAnsi="Times New Roman" w:cs="Times New Roman"/>
-        </w:rPr>
-        <w:t xml:space="preserve"> = </w:t>
-      </w:r>
-      <w:r>
-        <w:rPr>
-          <w:rFonts w:ascii="Times New Roman" w:hAnsi="Times New Roman" w:cs="Times New Roman"/>
-        </w:rPr>
-        <w:t>4.52 ± 0.49</w:t>
-      </w:r>
-      <w:r>
-        <w:rPr>
-          <w:rFonts w:ascii="Times New Roman" w:hAnsi="Times New Roman" w:cs="Times New Roman"/>
-        </w:rPr>
-        <w:t xml:space="preserve"> kcal/mol)</w:t>
-      </w:r>
-      <w:r>
-        <w:rPr>
-          <w:rFonts w:ascii="Times New Roman" w:hAnsi="Times New Roman" w:cs="Times New Roman"/>
-        </w:rPr>
-        <w:t xml:space="preserve"> </w:t>
-      </w:r>
-      <w:r>
-        <w:rPr>
-          <w:rFonts w:ascii="Times New Roman" w:hAnsi="Times New Roman" w:cs="Times New Roman"/>
-        </w:rPr>
-        <w:t>of any Resistant genotype</w:t>
-      </w:r>
-      <w:r>
-        <w:rPr>
-          <w:rFonts w:ascii="Times New Roman" w:hAnsi="Times New Roman" w:cs="Times New Roman"/>
-        </w:rPr>
-        <w:t xml:space="preserve"> </w:t>
-      </w:r>
-      <w:r>
-        <w:rPr>
-          <w:rFonts w:ascii="Times New Roman" w:hAnsi="Times New Roman" w:cs="Times New Roman"/>
-        </w:rPr>
         <w:t>occurs in the well-known Y188L mutation</w:t>
       </w:r>
       <w:r>
@@ -18974,19 +18623,7 @@
         <w:rPr>
           <w:rFonts w:ascii="Times New Roman" w:hAnsi="Times New Roman" w:cs="Times New Roman"/>
         </w:rPr>
-        <w:t xml:space="preserve">of the equilibrium </w:t>
-      </w:r>
-      <w:r>
-        <w:rPr>
-          <w:rFonts w:ascii="Times New Roman" w:hAnsi="Times New Roman" w:cs="Times New Roman"/>
-        </w:rPr>
-        <w:t xml:space="preserve">Y188L </w:t>
-      </w:r>
-      <w:r>
-        <w:rPr>
-          <w:rFonts w:ascii="Times New Roman" w:hAnsi="Times New Roman" w:cs="Times New Roman"/>
-        </w:rPr>
-        <w:t xml:space="preserve">simulations </w:t>
+        <w:t xml:space="preserve">of the equilibrium Y188L simulations </w:t>
       </w:r>
       <w:r>
         <w:rPr>
@@ -19029,14 +18666,14 @@
         <w:rPr>
           <w:rFonts w:ascii="Times New Roman" w:hAnsi="Times New Roman" w:cs="Times New Roman"/>
         </w:rPr>
-        <w:t xml:space="preserve"> This observation, together with a universally elevated polar solvation </w:t>
+        <w:t xml:space="preserve"> This observation, together with a universally elevated </w:t>
       </w:r>
       <w:r>
         <w:rPr>
           <w:rFonts w:ascii="Times New Roman" w:hAnsi="Times New Roman" w:cs="Times New Roman"/>
         </w:rPr>
         <w:lastRenderedPageBreak/>
-        <w:t>energy (∆∆E</w:t>
+        <w:t>polar solvation energy (∆∆E</w:t>
       </w:r>
       <w:r>
         <w:rPr>
@@ -19581,20 +19218,7 @@
           <w:rFonts w:ascii="Times New Roman" w:hAnsi="Times New Roman" w:cs="Times New Roman"/>
         </w:rPr>
         <w:tab/>
-      </w:r>
-      <w:proofErr w:type="spellStart"/>
-      <w:r>
-        <w:rPr>
-          <w:rFonts w:ascii="Times New Roman" w:hAnsi="Times New Roman" w:cs="Times New Roman"/>
-        </w:rPr>
-        <w:t>Kohlstaedt</w:t>
-      </w:r>
-      <w:proofErr w:type="spellEnd"/>
-      <w:r>
-        <w:rPr>
-          <w:rFonts w:ascii="Times New Roman" w:hAnsi="Times New Roman" w:cs="Times New Roman"/>
-        </w:rPr>
-        <w:t xml:space="preserve">, L. A.; Wang, J.; Friedman, J. M.; Rice, P. A.; Steitz, T. A. Crystal Structure at 3.5 Å Resolution of HIV-1 Reverse Transcriptase Complexed with an Inhibitor. </w:t>
+        <w:t xml:space="preserve">Kohlstaedt, L. A.; Wang, J.; Friedman, J. M.; Rice, P. A.; Steitz, T. A. Crystal Structure at 3.5 Å Resolution of HIV-1 Reverse Transcriptase Complexed with an Inhibitor. </w:t>
       </w:r>
       <w:r>
         <w:rPr>
@@ -19720,35 +19344,7 @@
           <w:rFonts w:ascii="Times New Roman" w:hAnsi="Times New Roman" w:cs="Times New Roman"/>
         </w:rPr>
         <w:tab/>
-        <w:t xml:space="preserve">Rodgers, D. W.; Gamblin, S. J.; Harris, B. A.; Ray, S.; Culp, J. S.; </w:t>
-      </w:r>
-      <w:proofErr w:type="spellStart"/>
-      <w:r>
-        <w:rPr>
-          <w:rFonts w:ascii="Times New Roman" w:hAnsi="Times New Roman" w:cs="Times New Roman"/>
-        </w:rPr>
-        <w:t>Hellmig</w:t>
-      </w:r>
-      <w:proofErr w:type="spellEnd"/>
-      <w:r>
-        <w:rPr>
-          <w:rFonts w:ascii="Times New Roman" w:hAnsi="Times New Roman" w:cs="Times New Roman"/>
-        </w:rPr>
-        <w:t xml:space="preserve">, B.; Woolf, D. J.; </w:t>
-      </w:r>
-      <w:proofErr w:type="spellStart"/>
-      <w:r>
-        <w:rPr>
-          <w:rFonts w:ascii="Times New Roman" w:hAnsi="Times New Roman" w:cs="Times New Roman"/>
-        </w:rPr>
-        <w:t>Debouck</w:t>
-      </w:r>
-      <w:proofErr w:type="spellEnd"/>
-      <w:r>
-        <w:rPr>
-          <w:rFonts w:ascii="Times New Roman" w:hAnsi="Times New Roman" w:cs="Times New Roman"/>
-        </w:rPr>
-        <w:t xml:space="preserve">, C.; Harrison, S. C. The Structure of Unliganded Reverse Transcriptase from the Human Immunodeficiency Virus Type 1. </w:t>
+        <w:t xml:space="preserve">Rodgers, D. W.; Gamblin, S. J.; Harris, B. A.; Ray, S.; Culp, J. S.; Hellmig, B.; Woolf, D. J.; Debouck, C.; Harrison, S. C. The Structure of Unliganded Reverse Transcriptase from the Human Immunodeficiency Virus Type 1. </w:t>
       </w:r>
       <w:r>
         <w:rPr>
@@ -19882,25 +19478,7 @@
           <w:i/>
           <w:iCs/>
         </w:rPr>
-        <w:t xml:space="preserve">Cold Spring Harb </w:t>
-      </w:r>
-      <w:proofErr w:type="spellStart"/>
-      <w:r>
-        <w:rPr>
-          <w:rFonts w:ascii="Times New Roman" w:hAnsi="Times New Roman" w:cs="Times New Roman"/>
-          <w:i/>
-          <w:iCs/>
-        </w:rPr>
-        <w:t>Perspect</w:t>
-      </w:r>
-      <w:proofErr w:type="spellEnd"/>
-      <w:r>
-        <w:rPr>
-          <w:rFonts w:ascii="Times New Roman" w:hAnsi="Times New Roman" w:cs="Times New Roman"/>
-          <w:i/>
-          <w:iCs/>
-        </w:rPr>
-        <w:t xml:space="preserve"> Med</w:t>
+        <w:t>Cold Spring Harb Perspect Med</w:t>
       </w:r>
       <w:r>
         <w:rPr>
@@ -19955,21 +19533,7 @@
           <w:rFonts w:ascii="Times New Roman" w:hAnsi="Times New Roman" w:cs="Times New Roman"/>
         </w:rPr>
         <w:tab/>
-        <w:t xml:space="preserve">Cilento, M. E.; Kirby, K. A.; </w:t>
-      </w:r>
-      <w:proofErr w:type="spellStart"/>
-      <w:r>
-        <w:rPr>
-          <w:rFonts w:ascii="Times New Roman" w:hAnsi="Times New Roman" w:cs="Times New Roman"/>
-        </w:rPr>
-        <w:t>Sarafianos</w:t>
-      </w:r>
-      <w:proofErr w:type="spellEnd"/>
-      <w:r>
-        <w:rPr>
-          <w:rFonts w:ascii="Times New Roman" w:hAnsi="Times New Roman" w:cs="Times New Roman"/>
-        </w:rPr>
-        <w:t xml:space="preserve">, S. G. Avoiding Drug Resistance in HIV Reverse Transcriptase. </w:t>
+        <w:t xml:space="preserve">Cilento, M. E.; Kirby, K. A.; Sarafianos, S. G. Avoiding Drug Resistance in HIV Reverse Transcriptase. </w:t>
       </w:r>
       <w:r>
         <w:rPr>
@@ -20165,21 +19729,7 @@
           <w:rFonts w:ascii="Times New Roman" w:hAnsi="Times New Roman" w:cs="Times New Roman"/>
         </w:rPr>
         <w:tab/>
-        <w:t xml:space="preserve">Hsiou, Y.; Ding, J.; Das, K.; Clark, A. D.; Boyer, P. L.; Lewi, P.; Janssen, P. A. J.; Kleim, J.-P.; </w:t>
-      </w:r>
-      <w:proofErr w:type="spellStart"/>
-      <w:r>
-        <w:rPr>
-          <w:rFonts w:ascii="Times New Roman" w:hAnsi="Times New Roman" w:cs="Times New Roman"/>
-        </w:rPr>
-        <w:t>Rösner</w:t>
-      </w:r>
-      <w:proofErr w:type="spellEnd"/>
-      <w:r>
-        <w:rPr>
-          <w:rFonts w:ascii="Times New Roman" w:hAnsi="Times New Roman" w:cs="Times New Roman"/>
-        </w:rPr>
-        <w:t xml:space="preserve">, M.; Hughes, S. H.; Arnold, E. The Lys103Asn Mutation of HIV-1 RT: A Novel Mechanism of Drug Resistance. </w:t>
+        <w:t xml:space="preserve">Hsiou, Y.; Ding, J.; Das, K.; Clark, A. D.; Boyer, P. L.; Lewi, P.; Janssen, P. A. J.; Kleim, J.-P.; Rösner, M.; Hughes, S. H.; Arnold, E. The Lys103Asn Mutation of HIV-1 RT: A Novel Mechanism of Drug Resistance. </w:t>
       </w:r>
       <w:r>
         <w:rPr>
@@ -20368,49 +19918,7 @@
           <w:rFonts w:ascii="Times New Roman" w:hAnsi="Times New Roman" w:cs="Times New Roman"/>
         </w:rPr>
         <w:tab/>
-        <w:t xml:space="preserve">Das, K.; Clark, Arthur D.; Lewi, P. J.; Heeres, J.; de Jonge, M. R.; </w:t>
-      </w:r>
-      <w:proofErr w:type="spellStart"/>
-      <w:r>
-        <w:rPr>
-          <w:rFonts w:ascii="Times New Roman" w:hAnsi="Times New Roman" w:cs="Times New Roman"/>
-        </w:rPr>
-        <w:t>Koymans</w:t>
-      </w:r>
-      <w:proofErr w:type="spellEnd"/>
-      <w:r>
-        <w:rPr>
-          <w:rFonts w:ascii="Times New Roman" w:hAnsi="Times New Roman" w:cs="Times New Roman"/>
-        </w:rPr>
-        <w:t xml:space="preserve">, L. M. H.; </w:t>
-      </w:r>
-      <w:proofErr w:type="spellStart"/>
-      <w:r>
-        <w:rPr>
-          <w:rFonts w:ascii="Times New Roman" w:hAnsi="Times New Roman" w:cs="Times New Roman"/>
-        </w:rPr>
-        <w:t>Vinkers</w:t>
-      </w:r>
-      <w:proofErr w:type="spellEnd"/>
-      <w:r>
-        <w:rPr>
-          <w:rFonts w:ascii="Times New Roman" w:hAnsi="Times New Roman" w:cs="Times New Roman"/>
-        </w:rPr>
-        <w:t xml:space="preserve">, H. M.; </w:t>
-      </w:r>
-      <w:proofErr w:type="spellStart"/>
-      <w:r>
-        <w:rPr>
-          <w:rFonts w:ascii="Times New Roman" w:hAnsi="Times New Roman" w:cs="Times New Roman"/>
-        </w:rPr>
-        <w:t>Daeyaert</w:t>
-      </w:r>
-      <w:proofErr w:type="spellEnd"/>
-      <w:r>
-        <w:rPr>
-          <w:rFonts w:ascii="Times New Roman" w:hAnsi="Times New Roman" w:cs="Times New Roman"/>
-        </w:rPr>
-        <w:t xml:space="preserve">, F.; Ludovici, D. W.; Kukla, M. J.; De Corte, B.; Kavash, R. W.; Ho, C. Y.; Ye, H.; Lichtenstein, Mark. A.; Andries, K.; Pauwels, R.; de Béthune, M.-P.; Boyer, P. L.; Clark, P.; Hughes, S. H.; Janssen, P. A. J.; Arnold, E. Roles of Conformational and Positional Adaptability in Structure-Based Design of TMC125-R165335 (Etravirine) and Related Non-Nucleoside Reverse Transcriptase Inhibitors That Are Highly Potent and Effective against Wild-Type and Drug-Resistant HIV-1 Variants. </w:t>
+        <w:t xml:space="preserve">Das, K.; Clark, Arthur D.; Lewi, P. J.; Heeres, J.; de Jonge, M. R.; Koymans, L. M. H.; Vinkers, H. M.; Daeyaert, F.; Ludovici, D. W.; Kukla, M. J.; De Corte, B.; Kavash, R. W.; Ho, C. Y.; Ye, H.; Lichtenstein, Mark. A.; Andries, K.; Pauwels, R.; de Béthune, M.-P.; Boyer, P. L.; Clark, P.; Hughes, S. H.; Janssen, P. A. J.; Arnold, E. Roles of Conformational and Positional Adaptability in Structure-Based Design of TMC125-R165335 (Etravirine) and Related Non-Nucleoside Reverse Transcriptase Inhibitors That Are Highly Potent and Effective against Wild-Type and Drug-Resistant HIV-1 Variants. </w:t>
       </w:r>
       <w:r>
         <w:rPr>
@@ -20536,91 +20044,7 @@
           <w:rFonts w:ascii="Times New Roman" w:hAnsi="Times New Roman" w:cs="Times New Roman"/>
         </w:rPr>
         <w:tab/>
-        <w:t xml:space="preserve">Côté, B.; Burch, J. D.; Asante-Appiah, E.; Bayly, C.; Bédard, L.; Blouin, M.; Campeau, L.-C.; Cauchon, E.; Chan, M.; </w:t>
-      </w:r>
-      <w:proofErr w:type="spellStart"/>
-      <w:r>
-        <w:rPr>
-          <w:rFonts w:ascii="Times New Roman" w:hAnsi="Times New Roman" w:cs="Times New Roman"/>
-        </w:rPr>
-        <w:t>Chefson</w:t>
-      </w:r>
-      <w:proofErr w:type="spellEnd"/>
-      <w:r>
-        <w:rPr>
-          <w:rFonts w:ascii="Times New Roman" w:hAnsi="Times New Roman" w:cs="Times New Roman"/>
-        </w:rPr>
-        <w:t xml:space="preserve">, A.; Coulombe, N.; </w:t>
-      </w:r>
-      <w:proofErr w:type="spellStart"/>
-      <w:r>
-        <w:rPr>
-          <w:rFonts w:ascii="Times New Roman" w:hAnsi="Times New Roman" w:cs="Times New Roman"/>
-        </w:rPr>
-        <w:t>Cromlish</w:t>
-      </w:r>
-      <w:proofErr w:type="spellEnd"/>
-      <w:r>
-        <w:rPr>
-          <w:rFonts w:ascii="Times New Roman" w:hAnsi="Times New Roman" w:cs="Times New Roman"/>
-        </w:rPr>
-        <w:t xml:space="preserve">, W.; Debnath, S.; </w:t>
-      </w:r>
-      <w:proofErr w:type="spellStart"/>
-      <w:r>
-        <w:rPr>
-          <w:rFonts w:ascii="Times New Roman" w:hAnsi="Times New Roman" w:cs="Times New Roman"/>
-        </w:rPr>
-        <w:t>Deschênes</w:t>
-      </w:r>
-      <w:proofErr w:type="spellEnd"/>
-      <w:r>
-        <w:rPr>
-          <w:rFonts w:ascii="Times New Roman" w:hAnsi="Times New Roman" w:cs="Times New Roman"/>
-        </w:rPr>
-        <w:t xml:space="preserve">, D.; Dupont-Gaudet, K.; </w:t>
-      </w:r>
-      <w:proofErr w:type="spellStart"/>
-      <w:r>
-        <w:rPr>
-          <w:rFonts w:ascii="Times New Roman" w:hAnsi="Times New Roman" w:cs="Times New Roman"/>
-        </w:rPr>
-        <w:t>Falgueyret</w:t>
-      </w:r>
-      <w:proofErr w:type="spellEnd"/>
-      <w:r>
-        <w:rPr>
-          <w:rFonts w:ascii="Times New Roman" w:hAnsi="Times New Roman" w:cs="Times New Roman"/>
-        </w:rPr>
-        <w:t xml:space="preserve">, J.-P.; Forget, R.; </w:t>
-      </w:r>
-      <w:proofErr w:type="spellStart"/>
-      <w:r>
-        <w:rPr>
-          <w:rFonts w:ascii="Times New Roman" w:hAnsi="Times New Roman" w:cs="Times New Roman"/>
-        </w:rPr>
-        <w:t>Gagné</w:t>
-      </w:r>
-      <w:proofErr w:type="spellEnd"/>
-      <w:r>
-        <w:rPr>
-          <w:rFonts w:ascii="Times New Roman" w:hAnsi="Times New Roman" w:cs="Times New Roman"/>
-        </w:rPr>
-        <w:t xml:space="preserve">, S.; Gauvreau, D.; Girardin, M.; Guiral, S.; Langlois, E.; Li, C. S.; Nguyen, N.; Papp, R.; Plamondon, S.; Roy, A.; Roy, S.; </w:t>
-      </w:r>
-      <w:proofErr w:type="spellStart"/>
-      <w:r>
-        <w:rPr>
-          <w:rFonts w:ascii="Times New Roman" w:hAnsi="Times New Roman" w:cs="Times New Roman"/>
-        </w:rPr>
-        <w:t>Seliniotakis</w:t>
-      </w:r>
-      <w:proofErr w:type="spellEnd"/>
-      <w:r>
-        <w:rPr>
-          <w:rFonts w:ascii="Times New Roman" w:hAnsi="Times New Roman" w:cs="Times New Roman"/>
-        </w:rPr>
-        <w:t xml:space="preserve">, R.; St-Onge, M.; Ouellet, S.; Tawa, P.; Truchon, J.-F.; Vacca, J.; Wrona, M.; Yan, Y.; Ducharme, Y. Discovery of MK-1439, an Orally Bioavailable Non-Nucleoside Reverse Transcriptase Inhibitor Potent against a Wide Range of Resistant Mutant HIV Viruses. </w:t>
+        <w:t xml:space="preserve">Côté, B.; Burch, J. D.; Asante-Appiah, E.; Bayly, C.; Bédard, L.; Blouin, M.; Campeau, L.-C.; Cauchon, E.; Chan, M.; Chefson, A.; Coulombe, N.; Cromlish, W.; Debnath, S.; Deschênes, D.; Dupont-Gaudet, K.; Falgueyret, J.-P.; Forget, R.; Gagné, S.; Gauvreau, D.; Girardin, M.; Guiral, S.; Langlois, E.; Li, C. S.; Nguyen, N.; Papp, R.; Plamondon, S.; Roy, A.; Roy, S.; Seliniotakis, R.; St-Onge, M.; Ouellet, S.; Tawa, P.; Truchon, J.-F.; Vacca, J.; Wrona, M.; Yan, Y.; Ducharme, Y. Discovery of MK-1439, an Orally Bioavailable Non-Nucleoside Reverse Transcriptase Inhibitor Potent against a Wide Range of Resistant Mutant HIV Viruses. </w:t>
       </w:r>
       <w:r>
         <w:rPr>
@@ -20809,21 +20233,7 @@
           <w:rFonts w:ascii="Times New Roman" w:hAnsi="Times New Roman" w:cs="Times New Roman"/>
         </w:rPr>
         <w:tab/>
-        <w:t xml:space="preserve">Lai, M.-T.; Feng, M.; </w:t>
-      </w:r>
-      <w:proofErr w:type="spellStart"/>
-      <w:r>
-        <w:rPr>
-          <w:rFonts w:ascii="Times New Roman" w:hAnsi="Times New Roman" w:cs="Times New Roman"/>
-        </w:rPr>
-        <w:t>Falgueyret</w:t>
-      </w:r>
-      <w:proofErr w:type="spellEnd"/>
-      <w:r>
-        <w:rPr>
-          <w:rFonts w:ascii="Times New Roman" w:hAnsi="Times New Roman" w:cs="Times New Roman"/>
-        </w:rPr>
-        <w:t>, J.-P.; Tawa, P.; Witmer, M.; DiStefano, D.; Li, Y.; Burch, J.; Sachs, N.; Lu, M.; Cauchon, E.; Campeau, L.-C.; Grobler, J.; Yan, Y.; Ducharme, Y.; Côté, B.; Asante-Appiah, E.; Hazuda, D. J.; Miller, M. D. In Vitro Characterization of MK-</w:t>
+        <w:t>Lai, M.-T.; Feng, M.; Falgueyret, J.-P.; Tawa, P.; Witmer, M.; DiStefano, D.; Li, Y.; Burch, J.; Sachs, N.; Lu, M.; Cauchon, E.; Campeau, L.-C.; Grobler, J.; Yan, Y.; Ducharme, Y.; Côté, B.; Asante-Appiah, E.; Hazuda, D. J.; Miller, M. D. In Vitro Characterization of MK-</w:t>
       </w:r>
       <w:r>
         <w:rPr>
@@ -20893,21 +20303,7 @@
           <w:rFonts w:ascii="Times New Roman" w:hAnsi="Times New Roman" w:cs="Times New Roman"/>
         </w:rPr>
         <w:tab/>
-        <w:t xml:space="preserve">Rhee, S.-Y.; Schapiro, J. M.; </w:t>
-      </w:r>
-      <w:proofErr w:type="spellStart"/>
-      <w:r>
-        <w:rPr>
-          <w:rFonts w:ascii="Times New Roman" w:hAnsi="Times New Roman" w:cs="Times New Roman"/>
-        </w:rPr>
-        <w:t>Saladini</w:t>
-      </w:r>
-      <w:proofErr w:type="spellEnd"/>
-      <w:r>
-        <w:rPr>
-          <w:rFonts w:ascii="Times New Roman" w:hAnsi="Times New Roman" w:cs="Times New Roman"/>
-        </w:rPr>
-        <w:t xml:space="preserve">, F.; Zazzi, M.; Khoo, S.; Shafer, R. W. Potential Role of Doravirine for the Treatment of HIV-1-Infected Persons with Transmitted Drug Resistance. </w:t>
+        <w:t xml:space="preserve">Rhee, S.-Y.; Schapiro, J. M.; Saladini, F.; Zazzi, M.; Khoo, S.; Shafer, R. W. Potential Role of Doravirine for the Treatment of HIV-1-Infected Persons with Transmitted Drug Resistance. </w:t>
       </w:r>
       <w:r>
         <w:rPr>
@@ -20970,49 +20366,7 @@
           <w:rFonts w:ascii="Times New Roman" w:hAnsi="Times New Roman" w:cs="Times New Roman"/>
         </w:rPr>
         <w:tab/>
-        <w:t xml:space="preserve">Calza, L.; </w:t>
-      </w:r>
-      <w:proofErr w:type="spellStart"/>
-      <w:r>
-        <w:rPr>
-          <w:rFonts w:ascii="Times New Roman" w:hAnsi="Times New Roman" w:cs="Times New Roman"/>
-        </w:rPr>
-        <w:t>Colangeli</w:t>
-      </w:r>
-      <w:proofErr w:type="spellEnd"/>
-      <w:r>
-        <w:rPr>
-          <w:rFonts w:ascii="Times New Roman" w:hAnsi="Times New Roman" w:cs="Times New Roman"/>
-        </w:rPr>
-        <w:t xml:space="preserve">, V.; </w:t>
-      </w:r>
-      <w:proofErr w:type="spellStart"/>
-      <w:r>
-        <w:rPr>
-          <w:rFonts w:ascii="Times New Roman" w:hAnsi="Times New Roman" w:cs="Times New Roman"/>
-        </w:rPr>
-        <w:t>Pensalfine</w:t>
-      </w:r>
-      <w:proofErr w:type="spellEnd"/>
-      <w:r>
-        <w:rPr>
-          <w:rFonts w:ascii="Times New Roman" w:hAnsi="Times New Roman" w:cs="Times New Roman"/>
-        </w:rPr>
-        <w:t xml:space="preserve">, G.; </w:t>
-      </w:r>
-      <w:proofErr w:type="spellStart"/>
-      <w:r>
-        <w:rPr>
-          <w:rFonts w:ascii="Times New Roman" w:hAnsi="Times New Roman" w:cs="Times New Roman"/>
-        </w:rPr>
-        <w:t>Appolloni</w:t>
-      </w:r>
-      <w:proofErr w:type="spellEnd"/>
-      <w:r>
-        <w:rPr>
-          <w:rFonts w:ascii="Times New Roman" w:hAnsi="Times New Roman" w:cs="Times New Roman"/>
-        </w:rPr>
-        <w:t xml:space="preserve">, L.; Vitale, S.; Bon, I.; Viale, P. Doravirine/Lamivudine/Tenofovir Disoproxil Fumarate in Virologically Suppressed People Living with HIV: A Real-Life Experience. </w:t>
+        <w:t xml:space="preserve">Calza, L.; Colangeli, V.; Pensalfine, G.; Appolloni, L.; Vitale, S.; Bon, I.; Viale, P. Doravirine/Lamivudine/Tenofovir Disoproxil Fumarate in Virologically Suppressed People Living with HIV: A Real-Life Experience. </w:t>
       </w:r>
       <w:r>
         <w:rPr>
@@ -21201,105 +20555,7 @@
           <w:rFonts w:ascii="Times New Roman" w:hAnsi="Times New Roman" w:cs="Times New Roman"/>
         </w:rPr>
         <w:tab/>
-        <w:t xml:space="preserve">Orkin, C.; </w:t>
-      </w:r>
-      <w:proofErr w:type="spellStart"/>
-      <w:r>
-        <w:rPr>
-          <w:rFonts w:ascii="Times New Roman" w:hAnsi="Times New Roman" w:cs="Times New Roman"/>
-        </w:rPr>
-        <w:t>Mngqibisa</w:t>
-      </w:r>
-      <w:proofErr w:type="spellEnd"/>
-      <w:r>
-        <w:rPr>
-          <w:rFonts w:ascii="Times New Roman" w:hAnsi="Times New Roman" w:cs="Times New Roman"/>
-        </w:rPr>
-        <w:t xml:space="preserve">, R.; Velez, J. D.; Kumar, P.; Braun, D. L.; Carr, A.; Bloch, M.; Walmsley, S.; </w:t>
-      </w:r>
-      <w:proofErr w:type="spellStart"/>
-      <w:r>
-        <w:rPr>
-          <w:rFonts w:ascii="Times New Roman" w:hAnsi="Times New Roman" w:cs="Times New Roman"/>
-        </w:rPr>
-        <w:t>Tebas</w:t>
-      </w:r>
-      <w:proofErr w:type="spellEnd"/>
-      <w:r>
-        <w:rPr>
-          <w:rFonts w:ascii="Times New Roman" w:hAnsi="Times New Roman" w:cs="Times New Roman"/>
-        </w:rPr>
-        <w:t xml:space="preserve">, P.; </w:t>
-      </w:r>
-      <w:proofErr w:type="spellStart"/>
-      <w:r>
-        <w:rPr>
-          <w:rFonts w:ascii="Times New Roman" w:hAnsi="Times New Roman" w:cs="Times New Roman"/>
-        </w:rPr>
-        <w:t>Yokomaku</w:t>
-      </w:r>
-      <w:proofErr w:type="spellEnd"/>
-      <w:r>
-        <w:rPr>
-          <w:rFonts w:ascii="Times New Roman" w:hAnsi="Times New Roman" w:cs="Times New Roman"/>
-        </w:rPr>
-        <w:t xml:space="preserve">, Y.; Diamond, T. L.; Jackson, B.; Eves, K.; Grandhi, A.; </w:t>
-      </w:r>
-      <w:proofErr w:type="spellStart"/>
-      <w:r>
-        <w:rPr>
-          <w:rFonts w:ascii="Times New Roman" w:hAnsi="Times New Roman" w:cs="Times New Roman"/>
-        </w:rPr>
-        <w:t>Fuszard</w:t>
-      </w:r>
-      <w:proofErr w:type="spellEnd"/>
-      <w:r>
-        <w:rPr>
-          <w:rFonts w:ascii="Times New Roman" w:hAnsi="Times New Roman" w:cs="Times New Roman"/>
-        </w:rPr>
-        <w:t xml:space="preserve">, M.; Klopfer, S. O.; Stamm, L. M.; Fox, M. C.; Kim, J. Switch to Fixed-Dose Doravirine (100 Mg) and </w:t>
-      </w:r>
-      <w:proofErr w:type="spellStart"/>
-      <w:r>
-        <w:rPr>
-          <w:rFonts w:ascii="Times New Roman" w:hAnsi="Times New Roman" w:cs="Times New Roman"/>
-        </w:rPr>
-        <w:t>Islatravir</w:t>
-      </w:r>
-      <w:proofErr w:type="spellEnd"/>
-      <w:r>
-        <w:rPr>
-          <w:rFonts w:ascii="Times New Roman" w:hAnsi="Times New Roman" w:cs="Times New Roman"/>
-        </w:rPr>
-        <w:t xml:space="preserve"> (0·25 Mg) Once Daily in Virologically Suppressed Adults with HIV-1 on Oral Antiretroviral Therapy: 48-Week Results of a Phase 3, </w:t>
-      </w:r>
-      <w:proofErr w:type="spellStart"/>
-      <w:r>
-        <w:rPr>
-          <w:rFonts w:ascii="Times New Roman" w:hAnsi="Times New Roman" w:cs="Times New Roman"/>
-        </w:rPr>
-        <w:t>Multicentre</w:t>
-      </w:r>
-      <w:proofErr w:type="spellEnd"/>
-      <w:r>
-        <w:rPr>
-          <w:rFonts w:ascii="Times New Roman" w:hAnsi="Times New Roman" w:cs="Times New Roman"/>
-        </w:rPr>
-        <w:t xml:space="preserve">, </w:t>
-      </w:r>
-      <w:proofErr w:type="spellStart"/>
-      <w:r>
-        <w:rPr>
-          <w:rFonts w:ascii="Times New Roman" w:hAnsi="Times New Roman" w:cs="Times New Roman"/>
-        </w:rPr>
-        <w:t>Randomised</w:t>
-      </w:r>
-      <w:proofErr w:type="spellEnd"/>
-      <w:r>
-        <w:rPr>
-          <w:rFonts w:ascii="Times New Roman" w:hAnsi="Times New Roman" w:cs="Times New Roman"/>
-        </w:rPr>
-        <w:t xml:space="preserve">, Open-Label, Non-Inferiority Trial. </w:t>
+        <w:t xml:space="preserve">Orkin, C.; Mngqibisa, R.; Velez, J. D.; Kumar, P.; Braun, D. L.; Carr, A.; Bloch, M.; Walmsley, S.; Tebas, P.; Yokomaku, Y.; Diamond, T. L.; Jackson, B.; Eves, K.; Grandhi, A.; Fuszard, M.; Klopfer, S. O.; Stamm, L. M.; Fox, M. C.; Kim, J. Switch to Fixed-Dose Doravirine (100 Mg) and Islatravir (0·25 Mg) Once Daily in Virologically Suppressed Adults with HIV-1 on Oral Antiretroviral Therapy: 48-Week Results of a Phase 3, Multicentre, Randomised, Open-Label, Non-Inferiority Trial. </w:t>
       </w:r>
       <w:r>
         <w:rPr>
@@ -21362,21 +20618,7 @@
           <w:rFonts w:ascii="Times New Roman" w:hAnsi="Times New Roman" w:cs="Times New Roman"/>
         </w:rPr>
         <w:tab/>
-        <w:t xml:space="preserve">Rizzo, R. C.; Wang, D.-P.; Tirado-Rives, J.; Jorgensen, W. L. Validation of a Model for the Complex of HIV-1 Reverse Transcriptase with </w:t>
-      </w:r>
-      <w:proofErr w:type="spellStart"/>
-      <w:r>
-        <w:rPr>
-          <w:rFonts w:ascii="Times New Roman" w:hAnsi="Times New Roman" w:cs="Times New Roman"/>
-        </w:rPr>
-        <w:t>Sustiva</w:t>
-      </w:r>
-      <w:proofErr w:type="spellEnd"/>
-      <w:r>
-        <w:rPr>
-          <w:rFonts w:ascii="Times New Roman" w:hAnsi="Times New Roman" w:cs="Times New Roman"/>
-        </w:rPr>
-        <w:t xml:space="preserve"> through Computation of Resistance Profiles. </w:t>
+        <w:t xml:space="preserve">Rizzo, R. C.; Wang, D.-P.; Tirado-Rives, J.; Jorgensen, W. L. Validation of a Model for the Complex of HIV-1 Reverse Transcriptase with Sustiva through Computation of Resistance Profiles. </w:t>
       </w:r>
       <w:r>
         <w:rPr>
@@ -21502,20 +20744,7 @@
           <w:rFonts w:ascii="Times New Roman" w:hAnsi="Times New Roman" w:cs="Times New Roman"/>
         </w:rPr>
         <w:tab/>
-      </w:r>
-      <w:proofErr w:type="spellStart"/>
-      <w:r>
-        <w:rPr>
-          <w:rFonts w:ascii="Times New Roman" w:hAnsi="Times New Roman" w:cs="Times New Roman"/>
-        </w:rPr>
-        <w:t>Udier-Blagović</w:t>
-      </w:r>
-      <w:proofErr w:type="spellEnd"/>
-      <w:r>
-        <w:rPr>
-          <w:rFonts w:ascii="Times New Roman" w:hAnsi="Times New Roman" w:cs="Times New Roman"/>
-        </w:rPr>
-        <w:t xml:space="preserve">, M.; Tirado-Rives, J.; Jorgensen, W. L. Validation of a Model for the Complex of HIV-1 Reverse Transcriptase with Nonnucleoside Inhibitor TMC125. </w:t>
+        <w:t xml:space="preserve">Udier-Blagović, M.; Tirado-Rives, J.; Jorgensen, W. L. Validation of a Model for the Complex of HIV-1 Reverse Transcriptase with Nonnucleoside Inhibitor TMC125. </w:t>
       </w:r>
       <w:r>
         <w:rPr>
@@ -21578,20 +20807,7 @@
           <w:rFonts w:ascii="Times New Roman" w:hAnsi="Times New Roman" w:cs="Times New Roman"/>
         </w:rPr>
         <w:tab/>
-      </w:r>
-      <w:proofErr w:type="spellStart"/>
-      <w:r>
-        <w:rPr>
-          <w:rFonts w:ascii="Times New Roman" w:hAnsi="Times New Roman" w:cs="Times New Roman"/>
-        </w:rPr>
-        <w:t>Udier-Blagović</w:t>
-      </w:r>
-      <w:proofErr w:type="spellEnd"/>
-      <w:r>
-        <w:rPr>
-          <w:rFonts w:ascii="Times New Roman" w:hAnsi="Times New Roman" w:cs="Times New Roman"/>
-        </w:rPr>
-        <w:t xml:space="preserve">, M.; Tirado-Rives, J.; Jorgensen, W. L. Structural and Energetic Analyses of the Effects of the K103N Mutation of HIV-1 Reverse Transcriptase on Efavirenz Analogues. </w:t>
+        <w:t xml:space="preserve">Udier-Blagović, M.; Tirado-Rives, J.; Jorgensen, W. L. Structural and Energetic Analyses of the Effects of the K103N Mutation of HIV-1 Reverse Transcriptase on Efavirenz Analogues. </w:t>
       </w:r>
       <w:r>
         <w:rPr>
@@ -21717,21 +20933,7 @@
           <w:rFonts w:ascii="Times New Roman" w:hAnsi="Times New Roman" w:cs="Times New Roman"/>
         </w:rPr>
         <w:tab/>
-        <w:t xml:space="preserve">Zhou, Z.; Madrid, M.; </w:t>
-      </w:r>
-      <w:proofErr w:type="spellStart"/>
-      <w:r>
-        <w:rPr>
-          <w:rFonts w:ascii="Times New Roman" w:hAnsi="Times New Roman" w:cs="Times New Roman"/>
-        </w:rPr>
-        <w:t>Evanseck</w:t>
-      </w:r>
-      <w:proofErr w:type="spellEnd"/>
-      <w:r>
-        <w:rPr>
-          <w:rFonts w:ascii="Times New Roman" w:hAnsi="Times New Roman" w:cs="Times New Roman"/>
-        </w:rPr>
-        <w:t xml:space="preserve">, J. D.; Madura, J. D. Effect of a Bound Non-Nucleoside RT Inhibitor on the Dynamics of Wild-Type and Mutant HIV-1 Reverse Transcriptase. </w:t>
+        <w:t xml:space="preserve">Zhou, Z.; Madrid, M.; Evanseck, J. D.; Madura, J. D. Effect of a Bound Non-Nucleoside RT Inhibitor on the Dynamics of Wild-Type and Mutant HIV-1 Reverse Transcriptase. </w:t>
       </w:r>
       <w:r>
         <w:rPr>
@@ -21858,21 +21060,7 @@
           <w:rFonts w:ascii="Times New Roman" w:hAnsi="Times New Roman" w:cs="Times New Roman"/>
         </w:rPr>
         <w:tab/>
-        <w:t xml:space="preserve">Geitmann, M.; </w:t>
-      </w:r>
-      <w:proofErr w:type="spellStart"/>
-      <w:r>
-        <w:rPr>
-          <w:rFonts w:ascii="Times New Roman" w:hAnsi="Times New Roman" w:cs="Times New Roman"/>
-        </w:rPr>
-        <w:t>Unge</w:t>
-      </w:r>
-      <w:proofErr w:type="spellEnd"/>
-      <w:r>
-        <w:rPr>
-          <w:rFonts w:ascii="Times New Roman" w:hAnsi="Times New Roman" w:cs="Times New Roman"/>
-        </w:rPr>
-        <w:t xml:space="preserve">, T.; Danielson, U. H. Interaction Kinetic Characterization of HIV-1 Reverse Transcriptase Non-Nucleoside Inhibitor Resistance. </w:t>
+        <w:t xml:space="preserve">Geitmann, M.; Unge, T.; Danielson, U. H. Interaction Kinetic Characterization of HIV-1 Reverse Transcriptase Non-Nucleoside Inhibitor Resistance. </w:t>
       </w:r>
       <w:r>
         <w:rPr>
@@ -21998,62 +21186,7 @@
           <w:rFonts w:ascii="Times New Roman" w:hAnsi="Times New Roman" w:cs="Times New Roman"/>
         </w:rPr>
         <w:tab/>
-      </w:r>
-      <w:proofErr w:type="spellStart"/>
-      <w:r>
-        <w:rPr>
-          <w:rFonts w:ascii="Times New Roman" w:hAnsi="Times New Roman" w:cs="Times New Roman"/>
-        </w:rPr>
-        <w:t>Gapsys</w:t>
-      </w:r>
-      <w:proofErr w:type="spellEnd"/>
-      <w:r>
-        <w:rPr>
-          <w:rFonts w:ascii="Times New Roman" w:hAnsi="Times New Roman" w:cs="Times New Roman"/>
-        </w:rPr>
-        <w:t xml:space="preserve">, V.; Pérez-Benito, L.; </w:t>
-      </w:r>
-      <w:proofErr w:type="spellStart"/>
-      <w:r>
-        <w:rPr>
-          <w:rFonts w:ascii="Times New Roman" w:hAnsi="Times New Roman" w:cs="Times New Roman"/>
-        </w:rPr>
-        <w:t>Aldeghi</w:t>
-      </w:r>
-      <w:proofErr w:type="spellEnd"/>
-      <w:r>
-        <w:rPr>
-          <w:rFonts w:ascii="Times New Roman" w:hAnsi="Times New Roman" w:cs="Times New Roman"/>
-        </w:rPr>
-        <w:t xml:space="preserve">, M.; Seeliger, D.; van </w:t>
-      </w:r>
-      <w:proofErr w:type="spellStart"/>
-      <w:r>
-        <w:rPr>
-          <w:rFonts w:ascii="Times New Roman" w:hAnsi="Times New Roman" w:cs="Times New Roman"/>
-        </w:rPr>
-        <w:t>Vlijmen</w:t>
-      </w:r>
-      <w:proofErr w:type="spellEnd"/>
-      <w:r>
-        <w:rPr>
-          <w:rFonts w:ascii="Times New Roman" w:hAnsi="Times New Roman" w:cs="Times New Roman"/>
-        </w:rPr>
-        <w:t xml:space="preserve">, H.; </w:t>
-      </w:r>
-      <w:proofErr w:type="spellStart"/>
-      <w:r>
-        <w:rPr>
-          <w:rFonts w:ascii="Times New Roman" w:hAnsi="Times New Roman" w:cs="Times New Roman"/>
-        </w:rPr>
-        <w:t>Tresadern</w:t>
-      </w:r>
-      <w:proofErr w:type="spellEnd"/>
-      <w:r>
-        <w:rPr>
-          <w:rFonts w:ascii="Times New Roman" w:hAnsi="Times New Roman" w:cs="Times New Roman"/>
-        </w:rPr>
-        <w:t xml:space="preserve">, G.; de Groot, B. L. Large Scale Relative Protein Ligand Binding Affinities Using Non-Equilibrium Alchemy. </w:t>
+        <w:t xml:space="preserve">Gapsys, V.; Pérez-Benito, L.; Aldeghi, M.; Seeliger, D.; van Vlijmen, H.; Tresadern, G.; de Groot, B. L. Large Scale Relative Protein Ligand Binding Affinities Using Non-Equilibrium Alchemy. </w:t>
       </w:r>
       <w:r>
         <w:rPr>
@@ -22116,35 +21249,7 @@
           <w:rFonts w:ascii="Times New Roman" w:hAnsi="Times New Roman" w:cs="Times New Roman"/>
         </w:rPr>
         <w:tab/>
-        <w:t xml:space="preserve">Kollman, P. A.; </w:t>
-      </w:r>
-      <w:proofErr w:type="spellStart"/>
-      <w:r>
-        <w:rPr>
-          <w:rFonts w:ascii="Times New Roman" w:hAnsi="Times New Roman" w:cs="Times New Roman"/>
-        </w:rPr>
-        <w:t>Massova</w:t>
-      </w:r>
-      <w:proofErr w:type="spellEnd"/>
-      <w:r>
-        <w:rPr>
-          <w:rFonts w:ascii="Times New Roman" w:hAnsi="Times New Roman" w:cs="Times New Roman"/>
-        </w:rPr>
-        <w:t xml:space="preserve">, I.; Reyes, C.; Kuhn, B.; Huo, S.; Chong, L.; Lee, M.; Lee, T.; Duan, Y.; Wang, W.; Donini, O.; </w:t>
-      </w:r>
-      <w:proofErr w:type="spellStart"/>
-      <w:r>
-        <w:rPr>
-          <w:rFonts w:ascii="Times New Roman" w:hAnsi="Times New Roman" w:cs="Times New Roman"/>
-        </w:rPr>
-        <w:t>Cieplak</w:t>
-      </w:r>
-      <w:proofErr w:type="spellEnd"/>
-      <w:r>
-        <w:rPr>
-          <w:rFonts w:ascii="Times New Roman" w:hAnsi="Times New Roman" w:cs="Times New Roman"/>
-        </w:rPr>
-        <w:t xml:space="preserve">, P.; Srinivasan, J.; Case, D. A.; Cheatham, T. E. Calculating Structures and Free Energies of Complex Molecules: Combining Molecular Mechanics and Continuum Models. </w:t>
+        <w:t xml:space="preserve">Kollman, P. A.; Massova, I.; Reyes, C.; Kuhn, B.; Huo, S.; Chong, L.; Lee, M.; Lee, T.; Duan, Y.; Wang, W.; Donini, O.; Cieplak, P.; Srinivasan, J.; Case, D. A.; Cheatham, T. E. Calculating Structures and Free Energies of Complex Molecules: Combining Molecular Mechanics and Continuum Models. </w:t>
       </w:r>
       <w:r>
         <w:rPr>
@@ -22207,20 +21312,7 @@
           <w:rFonts w:ascii="Times New Roman" w:hAnsi="Times New Roman" w:cs="Times New Roman"/>
         </w:rPr>
         <w:tab/>
-      </w:r>
-      <w:proofErr w:type="spellStart"/>
-      <w:r>
-        <w:rPr>
-          <w:rFonts w:ascii="Times New Roman" w:hAnsi="Times New Roman" w:cs="Times New Roman"/>
-        </w:rPr>
-        <w:t>Genheden</w:t>
-      </w:r>
-      <w:proofErr w:type="spellEnd"/>
-      <w:r>
-        <w:rPr>
-          <w:rFonts w:ascii="Times New Roman" w:hAnsi="Times New Roman" w:cs="Times New Roman"/>
-        </w:rPr>
-        <w:t xml:space="preserve">, S.; Ryde, U. The MM/PBSA and MM/GBSA Methods to Estimate Ligand-Binding Affinities. </w:t>
+        <w:t xml:space="preserve">Genheden, S.; Ryde, U. The MM/PBSA and MM/GBSA Methods to Estimate Ligand-Binding Affinities. </w:t>
       </w:r>
       <w:r>
         <w:rPr>
@@ -22283,20 +21375,7 @@
           <w:rFonts w:ascii="Times New Roman" w:hAnsi="Times New Roman" w:cs="Times New Roman"/>
         </w:rPr>
         <w:tab/>
-      </w:r>
-      <w:proofErr w:type="spellStart"/>
-      <w:r>
-        <w:rPr>
-          <w:rFonts w:ascii="Times New Roman" w:hAnsi="Times New Roman" w:cs="Times New Roman"/>
-        </w:rPr>
-        <w:t>Kabsch</w:t>
-      </w:r>
-      <w:proofErr w:type="spellEnd"/>
-      <w:r>
-        <w:rPr>
-          <w:rFonts w:ascii="Times New Roman" w:hAnsi="Times New Roman" w:cs="Times New Roman"/>
-        </w:rPr>
-        <w:t xml:space="preserve">, W. A Solution for the Best Rotation to Relate Two Sets of Vectors. </w:t>
+        <w:t xml:space="preserve">Kabsch, W. A Solution for the Best Rotation to Relate Two Sets of Vectors. </w:t>
       </w:r>
       <w:r>
         <w:rPr>
@@ -22304,25 +21383,7 @@
           <w:i/>
           <w:iCs/>
         </w:rPr>
-        <w:t xml:space="preserve">Acta </w:t>
-      </w:r>
-      <w:proofErr w:type="spellStart"/>
-      <w:r>
-        <w:rPr>
-          <w:rFonts w:ascii="Times New Roman" w:hAnsi="Times New Roman" w:cs="Times New Roman"/>
-          <w:i/>
-          <w:iCs/>
-        </w:rPr>
-        <w:t>Crystallographica</w:t>
-      </w:r>
-      <w:proofErr w:type="spellEnd"/>
-      <w:r>
-        <w:rPr>
-          <w:rFonts w:ascii="Times New Roman" w:hAnsi="Times New Roman" w:cs="Times New Roman"/>
-          <w:i/>
-          <w:iCs/>
-        </w:rPr>
-        <w:t xml:space="preserve"> Section A</w:t>
+        <w:t>Acta Crystallographica Section A</w:t>
       </w:r>
       <w:r>
         <w:rPr>
@@ -22377,35 +21438,7 @@
           <w:rFonts w:ascii="Times New Roman" w:hAnsi="Times New Roman" w:cs="Times New Roman"/>
         </w:rPr>
         <w:tab/>
-        <w:t xml:space="preserve">Eastman, P.; Swails, J.; </w:t>
-      </w:r>
-      <w:proofErr w:type="spellStart"/>
-      <w:r>
-        <w:rPr>
-          <w:rFonts w:ascii="Times New Roman" w:hAnsi="Times New Roman" w:cs="Times New Roman"/>
-        </w:rPr>
-        <w:t>Chodera</w:t>
-      </w:r>
-      <w:proofErr w:type="spellEnd"/>
-      <w:r>
-        <w:rPr>
-          <w:rFonts w:ascii="Times New Roman" w:hAnsi="Times New Roman" w:cs="Times New Roman"/>
-        </w:rPr>
-        <w:t xml:space="preserve">, J. D.; McGibbon, R. T.; Zhao, Y.; Beauchamp, K. A.; Wang, L.-P.; Simmonett, A. C.; Harrigan, M. P.; Stern, C. D.; Wiewiora, R. P.; Brooks, B. R.; Pande, V. S. </w:t>
-      </w:r>
-      <w:proofErr w:type="spellStart"/>
-      <w:r>
-        <w:rPr>
-          <w:rFonts w:ascii="Times New Roman" w:hAnsi="Times New Roman" w:cs="Times New Roman"/>
-        </w:rPr>
-        <w:t>OpenMM</w:t>
-      </w:r>
-      <w:proofErr w:type="spellEnd"/>
-      <w:r>
-        <w:rPr>
-          <w:rFonts w:ascii="Times New Roman" w:hAnsi="Times New Roman" w:cs="Times New Roman"/>
-        </w:rPr>
-        <w:t xml:space="preserve"> 7: Rapid Development of High Performance Algorithms for Molecular Dynamics. </w:t>
+        <w:t xml:space="preserve">Eastman, P.; Swails, J.; Chodera, J. D.; McGibbon, R. T.; Zhao, Y.; Beauchamp, K. A.; Wang, L.-P.; Simmonett, A. C.; Harrigan, M. P.; Stern, C. D.; Wiewiora, R. P.; Brooks, B. R.; Pande, V. S. OpenMM 7: Rapid Development of High Performance Algorithms for Molecular Dynamics. </w:t>
       </w:r>
       <w:r>
         <w:rPr>
@@ -22468,21 +21501,7 @@
           <w:rFonts w:ascii="Times New Roman" w:hAnsi="Times New Roman" w:cs="Times New Roman"/>
         </w:rPr>
         <w:tab/>
-        <w:t xml:space="preserve">Maier, J. A.; Martinez, C.; </w:t>
-      </w:r>
-      <w:proofErr w:type="spellStart"/>
-      <w:r>
-        <w:rPr>
-          <w:rFonts w:ascii="Times New Roman" w:hAnsi="Times New Roman" w:cs="Times New Roman"/>
-        </w:rPr>
-        <w:t>Kasavajhala</w:t>
-      </w:r>
-      <w:proofErr w:type="spellEnd"/>
-      <w:r>
-        <w:rPr>
-          <w:rFonts w:ascii="Times New Roman" w:hAnsi="Times New Roman" w:cs="Times New Roman"/>
-        </w:rPr>
-        <w:t xml:space="preserve">, K.; Wickstrom, L.; Hauser, K. E.; Simmerling, C. ff14SB: Improving the Accuracy of Protein Side Chain and Backbone Parameters from ff99SB. </w:t>
+        <w:t xml:space="preserve">Maier, J. A.; Martinez, C.; Kasavajhala, K.; Wickstrom, L.; Hauser, K. E.; Simmerling, C. ff14SB: Improving the Accuracy of Protein Side Chain and Backbone Parameters from ff99SB. </w:t>
       </w:r>
       <w:r>
         <w:rPr>
@@ -22490,25 +21509,7 @@
           <w:i/>
           <w:iCs/>
         </w:rPr>
-        <w:t xml:space="preserve">J. Chem. Theory </w:t>
-      </w:r>
-      <w:proofErr w:type="spellStart"/>
-      <w:r>
-        <w:rPr>
-          <w:rFonts w:ascii="Times New Roman" w:hAnsi="Times New Roman" w:cs="Times New Roman"/>
-          <w:i/>
-          <w:iCs/>
-        </w:rPr>
-        <w:t>Comput</w:t>
-      </w:r>
-      <w:proofErr w:type="spellEnd"/>
-      <w:r>
-        <w:rPr>
-          <w:rFonts w:ascii="Times New Roman" w:hAnsi="Times New Roman" w:cs="Times New Roman"/>
-          <w:i/>
-          <w:iCs/>
-        </w:rPr>
-        <w:t>.</w:t>
+        <w:t>J. Chem. Theory Comput.</w:t>
       </w:r>
       <w:r>
         <w:rPr>
@@ -22563,35 +21564,7 @@
           <w:rFonts w:ascii="Times New Roman" w:hAnsi="Times New Roman" w:cs="Times New Roman"/>
         </w:rPr>
         <w:tab/>
-        <w:t xml:space="preserve">Ivani, I.; Dans, P. D.; Noy, A.; Pérez, A.; Faustino, I.; Hospital, A.; Walther, J.; Andrio, P.; Goñi, R.; </w:t>
-      </w:r>
-      <w:proofErr w:type="spellStart"/>
-      <w:r>
-        <w:rPr>
-          <w:rFonts w:ascii="Times New Roman" w:hAnsi="Times New Roman" w:cs="Times New Roman"/>
-        </w:rPr>
-        <w:t>Balaceanu</w:t>
-      </w:r>
-      <w:proofErr w:type="spellEnd"/>
-      <w:r>
-        <w:rPr>
-          <w:rFonts w:ascii="Times New Roman" w:hAnsi="Times New Roman" w:cs="Times New Roman"/>
-        </w:rPr>
-        <w:t xml:space="preserve">, A.; Portella, G.; Battistini, F.; Gelpí, J. L.; González, C.; </w:t>
-      </w:r>
-      <w:proofErr w:type="spellStart"/>
-      <w:r>
-        <w:rPr>
-          <w:rFonts w:ascii="Times New Roman" w:hAnsi="Times New Roman" w:cs="Times New Roman"/>
-        </w:rPr>
-        <w:t>Vendruscolo</w:t>
-      </w:r>
-      <w:proofErr w:type="spellEnd"/>
-      <w:r>
-        <w:rPr>
-          <w:rFonts w:ascii="Times New Roman" w:hAnsi="Times New Roman" w:cs="Times New Roman"/>
-        </w:rPr>
-        <w:t xml:space="preserve">, M.; Laughton, C. A.; Harris, S. A.; Case, D. A.; Orozco, M. Parmbsc1: A Refined Force Field for DNA Simulations. </w:t>
+        <w:t xml:space="preserve">Ivani, I.; Dans, P. D.; Noy, A.; Pérez, A.; Faustino, I.; Hospital, A.; Walther, J.; Andrio, P.; Goñi, R.; Balaceanu, A.; Portella, G.; Battistini, F.; Gelpí, J. L.; González, C.; Vendruscolo, M.; Laughton, C. A.; Harris, S. A.; Case, D. A.; Orozco, M. Parmbsc1: A Refined Force Field for DNA Simulations. </w:t>
       </w:r>
       <w:r>
         <w:rPr>
@@ -22717,35 +21690,7 @@
           <w:rFonts w:ascii="Times New Roman" w:hAnsi="Times New Roman" w:cs="Times New Roman"/>
         </w:rPr>
         <w:tab/>
-        <w:t xml:space="preserve">Mobley, D. L.; Bannan, C. C.; Rizzi, A.; Bayly, C. I.; </w:t>
-      </w:r>
-      <w:proofErr w:type="spellStart"/>
-      <w:r>
-        <w:rPr>
-          <w:rFonts w:ascii="Times New Roman" w:hAnsi="Times New Roman" w:cs="Times New Roman"/>
-        </w:rPr>
-        <w:t>Chodera</w:t>
-      </w:r>
-      <w:proofErr w:type="spellEnd"/>
-      <w:r>
-        <w:rPr>
-          <w:rFonts w:ascii="Times New Roman" w:hAnsi="Times New Roman" w:cs="Times New Roman"/>
-        </w:rPr>
-        <w:t xml:space="preserve">, J. D.; Lim, V. T.; Lim, N. M.; Beauchamp, K. A.; </w:t>
-      </w:r>
-      <w:proofErr w:type="spellStart"/>
-      <w:r>
-        <w:rPr>
-          <w:rFonts w:ascii="Times New Roman" w:hAnsi="Times New Roman" w:cs="Times New Roman"/>
-        </w:rPr>
-        <w:t>Slochower</w:t>
-      </w:r>
-      <w:proofErr w:type="spellEnd"/>
-      <w:r>
-        <w:rPr>
-          <w:rFonts w:ascii="Times New Roman" w:hAnsi="Times New Roman" w:cs="Times New Roman"/>
-        </w:rPr>
-        <w:t xml:space="preserve">, D. R.; Shirts, M. R.; Gilson, M. K.; Eastman, P. K. Escaping Atom Types in Force Fields Using Direct Chemical Perception. </w:t>
+        <w:t xml:space="preserve">Mobley, D. L.; Bannan, C. C.; Rizzi, A.; Bayly, C. I.; Chodera, J. D.; Lim, V. T.; Lim, N. M.; Beauchamp, K. A.; Slochower, D. R.; Shirts, M. R.; Gilson, M. K.; Eastman, P. K. Escaping Atom Types in Force Fields Using Direct Chemical Perception. </w:t>
       </w:r>
       <w:r>
         <w:rPr>
@@ -22753,25 +21698,7 @@
           <w:i/>
           <w:iCs/>
         </w:rPr>
-        <w:t xml:space="preserve">J. Chem. Theory </w:t>
-      </w:r>
-      <w:proofErr w:type="spellStart"/>
-      <w:r>
-        <w:rPr>
-          <w:rFonts w:ascii="Times New Roman" w:hAnsi="Times New Roman" w:cs="Times New Roman"/>
-          <w:i/>
-          <w:iCs/>
-        </w:rPr>
-        <w:t>Comput</w:t>
-      </w:r>
-      <w:proofErr w:type="spellEnd"/>
-      <w:r>
-        <w:rPr>
-          <w:rFonts w:ascii="Times New Roman" w:hAnsi="Times New Roman" w:cs="Times New Roman"/>
-          <w:i/>
-          <w:iCs/>
-        </w:rPr>
-        <w:t>.</w:t>
+        <w:t>J. Chem. Theory Comput.</w:t>
       </w:r>
       <w:r>
         <w:rPr>
@@ -22890,14 +21817,7 @@
           <w:rFonts w:ascii="Times New Roman" w:hAnsi="Times New Roman" w:cs="Times New Roman"/>
         </w:rPr>
         <w:tab/>
-        <w:t xml:space="preserve">Darden, T.; York, D.; Pedersen, L. Particle Mesh Ewald: An </w:t>
-      </w:r>
-      <w:proofErr w:type="spellStart"/>
-      <w:r>
-        <w:rPr>
-          <w:rFonts w:ascii="Times New Roman" w:hAnsi="Times New Roman" w:cs="Times New Roman"/>
-        </w:rPr>
-        <w:t>N</w:t>
+        <w:t>Darden, T.; York, D.; Pedersen, L. Particle Mesh Ewald: An N</w:t>
       </w:r>
       <w:r>
         <w:rPr>
@@ -22909,14 +21829,7 @@
         <w:rPr>
           <w:rFonts w:ascii="Times New Roman" w:hAnsi="Times New Roman" w:cs="Times New Roman"/>
         </w:rPr>
-        <w:t>log</w:t>
-      </w:r>
-      <w:proofErr w:type="spellEnd"/>
-      <w:r>
-        <w:rPr>
-          <w:rFonts w:ascii="Times New Roman" w:hAnsi="Times New Roman" w:cs="Times New Roman"/>
-        </w:rPr>
-        <w:t xml:space="preserve">(N) Method for Ewald Sums in Large Systems. </w:t>
+        <w:t xml:space="preserve">log(N) Method for Ewald Sums in Large Systems. </w:t>
       </w:r>
       <w:r>
         <w:rPr>
@@ -22979,21 +21892,7 @@
           <w:rFonts w:ascii="Times New Roman" w:hAnsi="Times New Roman" w:cs="Times New Roman"/>
         </w:rPr>
         <w:tab/>
-        <w:t xml:space="preserve">Michaud-Agrawal, N.; Denning, E. J.; Woolf, T. B.; Beckstein, O. </w:t>
-      </w:r>
-      <w:proofErr w:type="spellStart"/>
-      <w:r>
-        <w:rPr>
-          <w:rFonts w:ascii="Times New Roman" w:hAnsi="Times New Roman" w:cs="Times New Roman"/>
-        </w:rPr>
-        <w:t>MDAnalysis</w:t>
-      </w:r>
-      <w:proofErr w:type="spellEnd"/>
-      <w:r>
-        <w:rPr>
-          <w:rFonts w:ascii="Times New Roman" w:hAnsi="Times New Roman" w:cs="Times New Roman"/>
-        </w:rPr>
-        <w:t xml:space="preserve">: A Toolkit for the Analysis of Molecular Dynamics Simulations. </w:t>
+        <w:t xml:space="preserve">Michaud-Agrawal, N.; Denning, E. J.; Woolf, T. B.; Beckstein, O. MDAnalysis: A Toolkit for the Analysis of Molecular Dynamics Simulations. </w:t>
       </w:r>
       <w:r>
         <w:rPr>
@@ -23056,21 +21955,7 @@
           <w:rFonts w:ascii="Times New Roman" w:hAnsi="Times New Roman" w:cs="Times New Roman"/>
         </w:rPr>
         <w:tab/>
-        <w:t xml:space="preserve">McGibbon, R. T.; Beauchamp, K. A.; Harrigan, M. P.; Klein, C.; Swails, J. M.; Hernández, C. X.; Schwantes, C. R.; Wang, L.-P.; Lane, T. J.; Pande, V. S. </w:t>
-      </w:r>
-      <w:proofErr w:type="spellStart"/>
-      <w:r>
-        <w:rPr>
-          <w:rFonts w:ascii="Times New Roman" w:hAnsi="Times New Roman" w:cs="Times New Roman"/>
-        </w:rPr>
-        <w:t>MDTraj</w:t>
-      </w:r>
-      <w:proofErr w:type="spellEnd"/>
-      <w:r>
-        <w:rPr>
-          <w:rFonts w:ascii="Times New Roman" w:hAnsi="Times New Roman" w:cs="Times New Roman"/>
-        </w:rPr>
-        <w:t xml:space="preserve">: A Modern Open Library for the Analysis of Molecular Dynamics Trajectories. </w:t>
+        <w:t xml:space="preserve">McGibbon, R. T.; Beauchamp, K. A.; Harrigan, M. P.; Klein, C.; Swails, J. M.; Hernández, C. X.; Schwantes, C. R.; Wang, L.-P.; Lane, T. J.; Pande, V. S. MDTraj: A Modern Open Library for the Analysis of Molecular Dynamics Trajectories. </w:t>
       </w:r>
       <w:r>
         <w:rPr>
@@ -23133,20 +22018,7 @@
           <w:rFonts w:ascii="Times New Roman" w:hAnsi="Times New Roman" w:cs="Times New Roman"/>
         </w:rPr>
         <w:tab/>
-      </w:r>
-      <w:proofErr w:type="spellStart"/>
-      <w:r>
-        <w:rPr>
-          <w:rFonts w:ascii="Times New Roman" w:hAnsi="Times New Roman" w:cs="Times New Roman"/>
-        </w:rPr>
-        <w:t>Massova</w:t>
-      </w:r>
-      <w:proofErr w:type="spellEnd"/>
-      <w:r>
-        <w:rPr>
-          <w:rFonts w:ascii="Times New Roman" w:hAnsi="Times New Roman" w:cs="Times New Roman"/>
-        </w:rPr>
-        <w:t xml:space="preserve">, I.; Kollman, P. A. Combined Molecular Mechanical and Continuum Solvent Approach (MM-PBSA/GBSA) to Predict Ligand Binding. </w:t>
+        <w:t xml:space="preserve">Massova, I.; Kollman, P. A. Combined Molecular Mechanical and Continuum Solvent Approach (MM-PBSA/GBSA) to Predict Ligand Binding. </w:t>
       </w:r>
       <w:r>
         <w:rPr>
@@ -23209,20 +22081,7 @@
           <w:rFonts w:ascii="Times New Roman" w:hAnsi="Times New Roman" w:cs="Times New Roman"/>
         </w:rPr>
         <w:tab/>
-      </w:r>
-      <w:proofErr w:type="spellStart"/>
-      <w:r>
-        <w:rPr>
-          <w:rFonts w:ascii="Times New Roman" w:hAnsi="Times New Roman" w:cs="Times New Roman"/>
-        </w:rPr>
-        <w:t>Onufriev</w:t>
-      </w:r>
-      <w:proofErr w:type="spellEnd"/>
-      <w:r>
-        <w:rPr>
-          <w:rFonts w:ascii="Times New Roman" w:hAnsi="Times New Roman" w:cs="Times New Roman"/>
-        </w:rPr>
-        <w:t xml:space="preserve">, A.; Bashford, D.; Case, D. A. Exploring Protein Native States and Large-Scale Conformational Changes with a Modified Generalized Born Model. </w:t>
+        <w:t xml:space="preserve">Onufriev, A.; Bashford, D.; Case, D. A. Exploring Protein Native States and Large-Scale Conformational Changes with a Modified Generalized Born Model. </w:t>
       </w:r>
       <w:r>
         <w:rPr>
@@ -23285,48 +22144,7 @@
           <w:rFonts w:ascii="Times New Roman" w:hAnsi="Times New Roman" w:cs="Times New Roman"/>
         </w:rPr>
         <w:tab/>
-      </w:r>
-      <w:proofErr w:type="spellStart"/>
-      <w:r>
-        <w:rPr>
-          <w:rFonts w:ascii="Times New Roman" w:hAnsi="Times New Roman" w:cs="Times New Roman"/>
-        </w:rPr>
-        <w:t>Gapsys</w:t>
-      </w:r>
-      <w:proofErr w:type="spellEnd"/>
-      <w:r>
-        <w:rPr>
-          <w:rFonts w:ascii="Times New Roman" w:hAnsi="Times New Roman" w:cs="Times New Roman"/>
-        </w:rPr>
-        <w:t xml:space="preserve">, V.; </w:t>
-      </w:r>
-      <w:proofErr w:type="spellStart"/>
-      <w:r>
-        <w:rPr>
-          <w:rFonts w:ascii="Times New Roman" w:hAnsi="Times New Roman" w:cs="Times New Roman"/>
-        </w:rPr>
-        <w:t>Michielssens</w:t>
-      </w:r>
-      <w:proofErr w:type="spellEnd"/>
-      <w:r>
-        <w:rPr>
-          <w:rFonts w:ascii="Times New Roman" w:hAnsi="Times New Roman" w:cs="Times New Roman"/>
-        </w:rPr>
-        <w:t xml:space="preserve">, S.; Seeliger, D.; de Groot, B. L. </w:t>
-      </w:r>
-      <w:proofErr w:type="spellStart"/>
-      <w:r>
-        <w:rPr>
-          <w:rFonts w:ascii="Times New Roman" w:hAnsi="Times New Roman" w:cs="Times New Roman"/>
-        </w:rPr>
-        <w:t>Pmx</w:t>
-      </w:r>
-      <w:proofErr w:type="spellEnd"/>
-      <w:r>
-        <w:rPr>
-          <w:rFonts w:ascii="Times New Roman" w:hAnsi="Times New Roman" w:cs="Times New Roman"/>
-        </w:rPr>
-        <w:t xml:space="preserve">: Automated Protein Structure and Topology Generation for Alchemical Perturbations. </w:t>
+        <w:t xml:space="preserve">Gapsys, V.; Michielssens, S.; Seeliger, D.; de Groot, B. L. Pmx: Automated Protein Structure and Topology Generation for Alchemical Perturbations. </w:t>
       </w:r>
       <w:r>
         <w:rPr>
@@ -23389,23 +22207,8 @@
           <w:rFonts w:ascii="Times New Roman" w:hAnsi="Times New Roman" w:cs="Times New Roman"/>
         </w:rPr>
         <w:tab/>
-        <w:t xml:space="preserve">Abraham, M. J.; </w:t>
-      </w:r>
-      <w:proofErr w:type="spellStart"/>
-      <w:r>
-        <w:rPr>
-          <w:rFonts w:ascii="Times New Roman" w:hAnsi="Times New Roman" w:cs="Times New Roman"/>
-        </w:rPr>
-        <w:t>Murtola</w:t>
-      </w:r>
-      <w:proofErr w:type="spellEnd"/>
-      <w:r>
-        <w:rPr>
-          <w:rFonts w:ascii="Times New Roman" w:hAnsi="Times New Roman" w:cs="Times New Roman"/>
-        </w:rPr>
-        <w:t xml:space="preserve">, T.; Schulz, R.; Páll, S.; Smith, J. C.; Hess, B.; Lindahl, E. GROMACS: High Performance Molecular Simulations through Multi-Level Parallelism from Laptops to Supercomputers. </w:t>
-      </w:r>
-      <w:proofErr w:type="spellStart"/>
+        <w:t xml:space="preserve">Abraham, M. J.; Murtola, T.; Schulz, R.; Páll, S.; Smith, J. C.; Hess, B.; Lindahl, E. GROMACS: High Performance Molecular Simulations through Multi-Level Parallelism from Laptops to Supercomputers. </w:t>
+      </w:r>
       <w:r>
         <w:rPr>
           <w:rFonts w:ascii="Times New Roman" w:hAnsi="Times New Roman" w:cs="Times New Roman"/>
@@ -23414,7 +22217,6 @@
         </w:rPr>
         <w:t>SoftwareX</w:t>
       </w:r>
-      <w:proofErr w:type="spellEnd"/>
       <w:r>
         <w:rPr>
           <w:rFonts w:ascii="Times New Roman" w:hAnsi="Times New Roman" w:cs="Times New Roman"/>
@@ -23468,20 +22270,7 @@
           <w:rFonts w:ascii="Times New Roman" w:hAnsi="Times New Roman" w:cs="Times New Roman"/>
         </w:rPr>
         <w:tab/>
-      </w:r>
-      <w:proofErr w:type="spellStart"/>
-      <w:r>
-        <w:rPr>
-          <w:rFonts w:ascii="Times New Roman" w:hAnsi="Times New Roman" w:cs="Times New Roman"/>
-        </w:rPr>
-        <w:t>Gapsys</w:t>
-      </w:r>
-      <w:proofErr w:type="spellEnd"/>
-      <w:r>
-        <w:rPr>
-          <w:rFonts w:ascii="Times New Roman" w:hAnsi="Times New Roman" w:cs="Times New Roman"/>
-        </w:rPr>
-        <w:t xml:space="preserve">, V.; Seeliger, D.; de Groot, B. L. New Soft-Core Potential Function for Molecular Dynamics Based Alchemical Free Energy Calculations. </w:t>
+        <w:t xml:space="preserve">Gapsys, V.; Seeliger, D.; de Groot, B. L. New Soft-Core Potential Function for Molecular Dynamics Based Alchemical Free Energy Calculations. </w:t>
       </w:r>
       <w:r>
         <w:rPr>
@@ -23489,25 +22278,7 @@
           <w:i/>
           <w:iCs/>
         </w:rPr>
-        <w:t xml:space="preserve">J. Chem. Theory </w:t>
-      </w:r>
-      <w:proofErr w:type="spellStart"/>
-      <w:r>
-        <w:rPr>
-          <w:rFonts w:ascii="Times New Roman" w:hAnsi="Times New Roman" w:cs="Times New Roman"/>
-          <w:i/>
-          <w:iCs/>
-        </w:rPr>
-        <w:t>Comput</w:t>
-      </w:r>
-      <w:proofErr w:type="spellEnd"/>
-      <w:r>
-        <w:rPr>
-          <w:rFonts w:ascii="Times New Roman" w:hAnsi="Times New Roman" w:cs="Times New Roman"/>
-          <w:i/>
-          <w:iCs/>
-        </w:rPr>
-        <w:t>.</w:t>
+        <w:t>J. Chem. Theory Comput.</w:t>
       </w:r>
       <w:r>
         <w:rPr>
@@ -23814,21 +22585,7 @@
           <w:rFonts w:ascii="Times New Roman" w:hAnsi="Times New Roman" w:cs="Times New Roman"/>
         </w:rPr>
         <w:tab/>
-        <w:t xml:space="preserve">Rocklin, G. J.; Mobley, D. L.; Dill, K. A.; </w:t>
-      </w:r>
-      <w:proofErr w:type="spellStart"/>
-      <w:r>
-        <w:rPr>
-          <w:rFonts w:ascii="Times New Roman" w:hAnsi="Times New Roman" w:cs="Times New Roman"/>
-        </w:rPr>
-        <w:t>Hünenberger</w:t>
-      </w:r>
-      <w:proofErr w:type="spellEnd"/>
-      <w:r>
-        <w:rPr>
-          <w:rFonts w:ascii="Times New Roman" w:hAnsi="Times New Roman" w:cs="Times New Roman"/>
-        </w:rPr>
-        <w:t xml:space="preserve">, P. H. Calculating the Binding Free Energies of Charged Species Based on Explicit-Solvent Simulations Employing Lattice-Sum Methods: An Accurate Correction Scheme for Electrostatic Finite-Size Effects. </w:t>
+        <w:t xml:space="preserve">Rocklin, G. J.; Mobley, D. L.; Dill, K. A.; Hünenberger, P. H. Calculating the Binding Free Energies of Charged Species Based on Explicit-Solvent Simulations Employing Lattice-Sum Methods: An Accurate Correction Scheme for Electrostatic Finite-Size Effects. </w:t>
       </w:r>
       <w:r>
         <w:rPr>
@@ -24159,25 +22916,7 @@
           <w:i/>
           <w:iCs/>
         </w:rPr>
-        <w:t xml:space="preserve">J. Chem. Theory </w:t>
-      </w:r>
-      <w:proofErr w:type="spellStart"/>
-      <w:r>
-        <w:rPr>
-          <w:rFonts w:ascii="Times New Roman" w:hAnsi="Times New Roman" w:cs="Times New Roman"/>
-          <w:i/>
-          <w:iCs/>
-        </w:rPr>
-        <w:t>Comput</w:t>
-      </w:r>
-      <w:proofErr w:type="spellEnd"/>
-      <w:r>
-        <w:rPr>
-          <w:rFonts w:ascii="Times New Roman" w:hAnsi="Times New Roman" w:cs="Times New Roman"/>
-          <w:i/>
-          <w:iCs/>
-        </w:rPr>
-        <w:t>.</w:t>
+        <w:t>J. Chem. Theory Comput.</w:t>
       </w:r>
       <w:r>
         <w:rPr>
@@ -24232,49 +22971,7 @@
           <w:rFonts w:ascii="Times New Roman" w:hAnsi="Times New Roman" w:cs="Times New Roman"/>
         </w:rPr>
         <w:tab/>
-        <w:t xml:space="preserve">Ripoll, D. R.; </w:t>
-      </w:r>
-      <w:proofErr w:type="spellStart"/>
-      <w:r>
-        <w:rPr>
-          <w:rFonts w:ascii="Times New Roman" w:hAnsi="Times New Roman" w:cs="Times New Roman"/>
-        </w:rPr>
-        <w:t>Khavrutskii</w:t>
-      </w:r>
-      <w:proofErr w:type="spellEnd"/>
-      <w:r>
-        <w:rPr>
-          <w:rFonts w:ascii="Times New Roman" w:hAnsi="Times New Roman" w:cs="Times New Roman"/>
-        </w:rPr>
-        <w:t xml:space="preserve">, I. V.; Chaudhury, S.; Liu, J.; </w:t>
-      </w:r>
-      <w:proofErr w:type="spellStart"/>
-      <w:r>
-        <w:rPr>
-          <w:rFonts w:ascii="Times New Roman" w:hAnsi="Times New Roman" w:cs="Times New Roman"/>
-        </w:rPr>
-        <w:t>Kuschner</w:t>
-      </w:r>
-      <w:proofErr w:type="spellEnd"/>
-      <w:r>
-        <w:rPr>
-          <w:rFonts w:ascii="Times New Roman" w:hAnsi="Times New Roman" w:cs="Times New Roman"/>
-        </w:rPr>
-        <w:t xml:space="preserve">, R. A.; </w:t>
-      </w:r>
-      <w:proofErr w:type="spellStart"/>
-      <w:r>
-        <w:rPr>
-          <w:rFonts w:ascii="Times New Roman" w:hAnsi="Times New Roman" w:cs="Times New Roman"/>
-        </w:rPr>
-        <w:t>Wallqvist</w:t>
-      </w:r>
-      <w:proofErr w:type="spellEnd"/>
-      <w:r>
-        <w:rPr>
-          <w:rFonts w:ascii="Times New Roman" w:hAnsi="Times New Roman" w:cs="Times New Roman"/>
-        </w:rPr>
-        <w:t xml:space="preserve">, A.; Reifman, J. Quantitative Predictions of Binding Free Energy Changes in Drug-Resistant Influenza Neuraminidase. </w:t>
+        <w:t xml:space="preserve">Ripoll, D. R.; Khavrutskii, I. V.; Chaudhury, S.; Liu, J.; Kuschner, R. A.; Wallqvist, A.; Reifman, J. Quantitative Predictions of Binding Free Energy Changes in Drug-Resistant Influenza Neuraminidase. </w:t>
       </w:r>
       <w:r>
         <w:rPr>
@@ -24337,35 +23034,7 @@
           <w:rFonts w:ascii="Times New Roman" w:hAnsi="Times New Roman" w:cs="Times New Roman"/>
         </w:rPr>
         <w:tab/>
-        <w:t xml:space="preserve">Havranek, B.; Demissie, R.; Lee, H.; Lan, S.; Zhang, H.; </w:t>
-      </w:r>
-      <w:proofErr w:type="spellStart"/>
-      <w:r>
-        <w:rPr>
-          <w:rFonts w:ascii="Times New Roman" w:hAnsi="Times New Roman" w:cs="Times New Roman"/>
-        </w:rPr>
-        <w:t>Sarafianos</w:t>
-      </w:r>
-      <w:proofErr w:type="spellEnd"/>
-      <w:r>
-        <w:rPr>
-          <w:rFonts w:ascii="Times New Roman" w:hAnsi="Times New Roman" w:cs="Times New Roman"/>
-        </w:rPr>
-        <w:t xml:space="preserve">, S.; </w:t>
-      </w:r>
-      <w:proofErr w:type="spellStart"/>
-      <w:r>
-        <w:rPr>
-          <w:rFonts w:ascii="Times New Roman" w:hAnsi="Times New Roman" w:cs="Times New Roman"/>
-        </w:rPr>
-        <w:t>Ayitou</w:t>
-      </w:r>
-      <w:proofErr w:type="spellEnd"/>
-      <w:r>
-        <w:rPr>
-          <w:rFonts w:ascii="Times New Roman" w:hAnsi="Times New Roman" w:cs="Times New Roman"/>
-        </w:rPr>
-        <w:t xml:space="preserve">, A. J.-L.; Islam, S. M. Discovery of Nirmatrelvir Resistance Mutations in SARS-CoV‑2 3CLpro: A Computational-Experimental Approach. </w:t>
+        <w:t xml:space="preserve">Havranek, B.; Demissie, R.; Lee, H.; Lan, S.; Zhang, H.; Sarafianos, S.; Ayitou, A. J.-L.; Islam, S. M. Discovery of Nirmatrelvir Resistance Mutations in SARS-CoV‑2 3CLpro: A Computational-Experimental Approach. </w:t>
       </w:r>
       <w:r>
         <w:rPr>
@@ -24436,25 +23105,7 @@
           <w:i/>
           <w:iCs/>
         </w:rPr>
-        <w:t xml:space="preserve">J. Chem. Theory </w:t>
-      </w:r>
-      <w:proofErr w:type="spellStart"/>
-      <w:r>
-        <w:rPr>
-          <w:rFonts w:ascii="Times New Roman" w:hAnsi="Times New Roman" w:cs="Times New Roman"/>
-          <w:i/>
-          <w:iCs/>
-        </w:rPr>
-        <w:t>Comput</w:t>
-      </w:r>
-      <w:proofErr w:type="spellEnd"/>
-      <w:r>
-        <w:rPr>
-          <w:rFonts w:ascii="Times New Roman" w:hAnsi="Times New Roman" w:cs="Times New Roman"/>
-          <w:i/>
-          <w:iCs/>
-        </w:rPr>
-        <w:t>.</w:t>
+        <w:t>J. Chem. Theory Comput.</w:t>
       </w:r>
       <w:r>
         <w:rPr>
@@ -24509,34 +23160,7 @@
           <w:rFonts w:ascii="Times New Roman" w:hAnsi="Times New Roman" w:cs="Times New Roman"/>
         </w:rPr>
         <w:tab/>
-      </w:r>
-      <w:proofErr w:type="spellStart"/>
-      <w:r>
-        <w:rPr>
-          <w:rFonts w:ascii="Times New Roman" w:hAnsi="Times New Roman" w:cs="Times New Roman"/>
-        </w:rPr>
-        <w:t>Bastys</w:t>
-      </w:r>
-      <w:proofErr w:type="spellEnd"/>
-      <w:r>
-        <w:rPr>
-          <w:rFonts w:ascii="Times New Roman" w:hAnsi="Times New Roman" w:cs="Times New Roman"/>
-        </w:rPr>
-        <w:t xml:space="preserve">, T.; </w:t>
-      </w:r>
-      <w:proofErr w:type="spellStart"/>
-      <w:r>
-        <w:rPr>
-          <w:rFonts w:ascii="Times New Roman" w:hAnsi="Times New Roman" w:cs="Times New Roman"/>
-        </w:rPr>
-        <w:t>Gapsys</w:t>
-      </w:r>
-      <w:proofErr w:type="spellEnd"/>
-      <w:r>
-        <w:rPr>
-          <w:rFonts w:ascii="Times New Roman" w:hAnsi="Times New Roman" w:cs="Times New Roman"/>
-        </w:rPr>
-        <w:t xml:space="preserve">, V.; Doncheva, N. T.; Kaiser, R.; de Groot, B. L.; Kalinina, O. V. Consistent Prediction of Mutation Effect on Drug Binding in HIV‑1 Protease Using Alchemical Calculations. </w:t>
+        <w:t xml:space="preserve">Bastys, T.; Gapsys, V.; Doncheva, N. T.; Kaiser, R.; de Groot, B. L.; Kalinina, O. V. Consistent Prediction of Mutation Effect on Drug Binding in HIV‑1 Protease Using Alchemical Calculations. </w:t>
       </w:r>
       <w:r>
         <w:rPr>
@@ -24544,25 +23168,7 @@
           <w:i/>
           <w:iCs/>
         </w:rPr>
-        <w:t xml:space="preserve">J. Chem. Theory </w:t>
-      </w:r>
-      <w:proofErr w:type="spellStart"/>
-      <w:r>
-        <w:rPr>
-          <w:rFonts w:ascii="Times New Roman" w:hAnsi="Times New Roman" w:cs="Times New Roman"/>
-          <w:i/>
-          <w:iCs/>
-        </w:rPr>
-        <w:t>Comput</w:t>
-      </w:r>
-      <w:proofErr w:type="spellEnd"/>
-      <w:r>
-        <w:rPr>
-          <w:rFonts w:ascii="Times New Roman" w:hAnsi="Times New Roman" w:cs="Times New Roman"/>
-          <w:i/>
-          <w:iCs/>
-        </w:rPr>
-        <w:t>.</w:t>
+        <w:t>J. Chem. Theory Comput.</w:t>
       </w:r>
       <w:r>
         <w:rPr>
@@ -24617,48 +23223,7 @@
           <w:rFonts w:ascii="Times New Roman" w:hAnsi="Times New Roman" w:cs="Times New Roman"/>
         </w:rPr>
         <w:tab/>
-      </w:r>
-      <w:proofErr w:type="spellStart"/>
-      <w:r>
-        <w:rPr>
-          <w:rFonts w:ascii="Times New Roman" w:hAnsi="Times New Roman" w:cs="Times New Roman"/>
-        </w:rPr>
-        <w:t>Bastys</w:t>
-      </w:r>
-      <w:proofErr w:type="spellEnd"/>
-      <w:r>
-        <w:rPr>
-          <w:rFonts w:ascii="Times New Roman" w:hAnsi="Times New Roman" w:cs="Times New Roman"/>
-        </w:rPr>
-        <w:t xml:space="preserve">, T.; </w:t>
-      </w:r>
-      <w:proofErr w:type="spellStart"/>
-      <w:r>
-        <w:rPr>
-          <w:rFonts w:ascii="Times New Roman" w:hAnsi="Times New Roman" w:cs="Times New Roman"/>
-        </w:rPr>
-        <w:t>Gapsys</w:t>
-      </w:r>
-      <w:proofErr w:type="spellEnd"/>
-      <w:r>
-        <w:rPr>
-          <w:rFonts w:ascii="Times New Roman" w:hAnsi="Times New Roman" w:cs="Times New Roman"/>
-        </w:rPr>
-        <w:t xml:space="preserve">, V.; Walter, H.; Heger, E.; Doncheva, N. T.; Kaiser, R.; de Groot, B. L.; Kalinina, O. V. Non-Active Site Mutants of HIV-1 Protease Influence Resistance and </w:t>
-      </w:r>
-      <w:proofErr w:type="spellStart"/>
-      <w:r>
-        <w:rPr>
-          <w:rFonts w:ascii="Times New Roman" w:hAnsi="Times New Roman" w:cs="Times New Roman"/>
-        </w:rPr>
-        <w:t>Sensitisation</w:t>
-      </w:r>
-      <w:proofErr w:type="spellEnd"/>
-      <w:r>
-        <w:rPr>
-          <w:rFonts w:ascii="Times New Roman" w:hAnsi="Times New Roman" w:cs="Times New Roman"/>
-        </w:rPr>
-        <w:t xml:space="preserve"> towards Protease Inhibitors. </w:t>
+        <w:t xml:space="preserve">Bastys, T.; Gapsys, V.; Walter, H.; Heger, E.; Doncheva, N. T.; Kaiser, R.; de Groot, B. L.; Kalinina, O. V. Non-Active Site Mutants of HIV-1 Protease Influence Resistance and Sensitisation towards Protease Inhibitors. </w:t>
       </w:r>
       <w:r>
         <w:rPr>
@@ -24721,21 +23286,7 @@
           <w:rFonts w:ascii="Times New Roman" w:hAnsi="Times New Roman" w:cs="Times New Roman"/>
         </w:rPr>
         <w:tab/>
-        <w:t xml:space="preserve">Sun, Q.; Levy, R. M.; Kirby, K. A.; Wang, Z.; </w:t>
-      </w:r>
-      <w:proofErr w:type="spellStart"/>
-      <w:r>
-        <w:rPr>
-          <w:rFonts w:ascii="Times New Roman" w:hAnsi="Times New Roman" w:cs="Times New Roman"/>
-        </w:rPr>
-        <w:t>Sarafianos</w:t>
-      </w:r>
-      <w:proofErr w:type="spellEnd"/>
-      <w:r>
-        <w:rPr>
-          <w:rFonts w:ascii="Times New Roman" w:hAnsi="Times New Roman" w:cs="Times New Roman"/>
-        </w:rPr>
-        <w:t xml:space="preserve">, S. G.; Deng, N. Molecular Dynamics Free Energy Simulations Reveal the Mechanism for the Antiviral Resistance of the M66I HIV-1 Capsid Mutation. </w:t>
+        <w:t xml:space="preserve">Sun, Q.; Levy, R. M.; Kirby, K. A.; Wang, Z.; Sarafianos, S. G.; Deng, N. Molecular Dynamics Free Energy Simulations Reveal the Mechanism for the Antiviral Resistance of the M66I HIV-1 Capsid Mutation. </w:t>
       </w:r>
       <w:r>
         <w:rPr>
@@ -24798,42 +23349,14 @@
           <w:rFonts w:ascii="Times New Roman" w:hAnsi="Times New Roman" w:cs="Times New Roman"/>
         </w:rPr>
         <w:tab/>
-        <w:t xml:space="preserve">Li, M.; Oliveira Passos, D.; Shan, Z.; Smith, S. J.; Sun, Q.; Biswas, A.; Choudhuri, I.; </w:t>
-      </w:r>
-      <w:proofErr w:type="spellStart"/>
-      <w:r>
-        <w:rPr>
-          <w:rFonts w:ascii="Times New Roman" w:hAnsi="Times New Roman" w:cs="Times New Roman"/>
-        </w:rPr>
-        <w:t>Strutzenberg</w:t>
-      </w:r>
-      <w:proofErr w:type="spellEnd"/>
-      <w:r>
-        <w:rPr>
-          <w:rFonts w:ascii="Times New Roman" w:hAnsi="Times New Roman" w:cs="Times New Roman"/>
-        </w:rPr>
-        <w:t xml:space="preserve">, T. S.; Haldane, A.; Deng, N.; Li, Z.; Zhao, X. Z.; Briganti, L.; Kvaratskhelia, </w:t>
+        <w:t xml:space="preserve">Li, M.; Oliveira Passos, D.; Shan, Z.; Smith, S. J.; Sun, Q.; Biswas, A.; Choudhuri, I.; Strutzenberg, T. S.; Haldane, A.; Deng, N.; Li, Z.; Zhao, X. Z.; Briganti, L.; Kvaratskhelia, </w:t>
       </w:r>
       <w:r>
         <w:rPr>
           <w:rFonts w:ascii="Times New Roman" w:hAnsi="Times New Roman" w:cs="Times New Roman"/>
         </w:rPr>
         <w:lastRenderedPageBreak/>
-        <w:t xml:space="preserve">M.; Burke, T. R.; Levy, R. M.; Hughes, S. H.; Craigie, R.; </w:t>
-      </w:r>
-      <w:proofErr w:type="spellStart"/>
-      <w:r>
-        <w:rPr>
-          <w:rFonts w:ascii="Times New Roman" w:hAnsi="Times New Roman" w:cs="Times New Roman"/>
-        </w:rPr>
-        <w:t>Lyumkis</w:t>
-      </w:r>
-      <w:proofErr w:type="spellEnd"/>
-      <w:r>
-        <w:rPr>
-          <w:rFonts w:ascii="Times New Roman" w:hAnsi="Times New Roman" w:cs="Times New Roman"/>
-        </w:rPr>
-        <w:t xml:space="preserve">, D. Mechanisms of HIV-1 Integrase Resistance to Dolutegravir and Potent Inhibition of Drug-Resistant Variants. </w:t>
+        <w:t xml:space="preserve">M.; Burke, T. R.; Levy, R. M.; Hughes, S. H.; Craigie, R.; Lyumkis, D. Mechanisms of HIV-1 Integrase Resistance to Dolutegravir and Potent Inhibition of Drug-Resistant Variants. </w:t>
       </w:r>
       <w:r>
         <w:rPr>
@@ -24896,21 +23419,7 @@
           <w:rFonts w:ascii="Times New Roman" w:hAnsi="Times New Roman" w:cs="Times New Roman"/>
         </w:rPr>
         <w:tab/>
-        <w:t xml:space="preserve">Hauser, K.; Negron, C.; Albanese, S. K.; Ray, S.; Steinbrecher, T.; Abel, R.; </w:t>
-      </w:r>
-      <w:proofErr w:type="spellStart"/>
-      <w:r>
-        <w:rPr>
-          <w:rFonts w:ascii="Times New Roman" w:hAnsi="Times New Roman" w:cs="Times New Roman"/>
-        </w:rPr>
-        <w:t>Chodera</w:t>
-      </w:r>
-      <w:proofErr w:type="spellEnd"/>
-      <w:r>
-        <w:rPr>
-          <w:rFonts w:ascii="Times New Roman" w:hAnsi="Times New Roman" w:cs="Times New Roman"/>
-        </w:rPr>
-        <w:t xml:space="preserve">, J. D.; Wang, L. Predicting Resistance of Clinical Abl Mutations to Targeted Kinase Inhibitors Using Alchemical Free-Energy Calculations. </w:t>
+        <w:t xml:space="preserve">Hauser, K.; Negron, C.; Albanese, S. K.; Ray, S.; Steinbrecher, T.; Abel, R.; Chodera, J. D.; Wang, L. Predicting Resistance of Clinical Abl Mutations to Targeted Kinase Inhibitors Using Alchemical Free-Energy Calculations. </w:t>
       </w:r>
       <w:r>
         <w:rPr>
@@ -24973,35 +23482,7 @@
           <w:rFonts w:ascii="Times New Roman" w:hAnsi="Times New Roman" w:cs="Times New Roman"/>
         </w:rPr>
         <w:tab/>
-        <w:t xml:space="preserve">Nagarajan, A.; Amberg-Johnson, K.; Paull, E.; Huang, K.; </w:t>
-      </w:r>
-      <w:proofErr w:type="spellStart"/>
-      <w:r>
-        <w:rPr>
-          <w:rFonts w:ascii="Times New Roman" w:hAnsi="Times New Roman" w:cs="Times New Roman"/>
-        </w:rPr>
-        <w:t>Ghanakota</w:t>
-      </w:r>
-      <w:proofErr w:type="spellEnd"/>
-      <w:r>
-        <w:rPr>
-          <w:rFonts w:ascii="Times New Roman" w:hAnsi="Times New Roman" w:cs="Times New Roman"/>
-        </w:rPr>
-        <w:t xml:space="preserve">, P.; </w:t>
-      </w:r>
-      <w:proofErr w:type="spellStart"/>
-      <w:r>
-        <w:rPr>
-          <w:rFonts w:ascii="Times New Roman" w:hAnsi="Times New Roman" w:cs="Times New Roman"/>
-        </w:rPr>
-        <w:t>Chandrasinghe</w:t>
-      </w:r>
-      <w:proofErr w:type="spellEnd"/>
-      <w:r>
-        <w:rPr>
-          <w:rFonts w:ascii="Times New Roman" w:hAnsi="Times New Roman" w:cs="Times New Roman"/>
-        </w:rPr>
-        <w:t xml:space="preserve">, A.; Chief Elk, J.; Sampson, J. M.; Wang, L.; Abel, R.; Albanese, S. K. Predicting Resistance to Small Molecule Kinase Inhibitors. </w:t>
+        <w:t xml:space="preserve">Nagarajan, A.; Amberg-Johnson, K.; Paull, E.; Huang, K.; Ghanakota, P.; Chandrasinghe, A.; Chief Elk, J.; Sampson, J. M.; Wang, L.; Abel, R.; Albanese, S. K. Predicting Resistance to Small Molecule Kinase Inhibitors. </w:t>
       </w:r>
       <w:r>
         <w:rPr>
@@ -25064,35 +23545,7 @@
           <w:rFonts w:ascii="Times New Roman" w:hAnsi="Times New Roman" w:cs="Times New Roman"/>
         </w:rPr>
         <w:tab/>
-        <w:t xml:space="preserve">Wang, L.; Wu, Y.; Deng, Y.; Kim, B.; Pierce, L.; Krilov, G.; </w:t>
-      </w:r>
-      <w:proofErr w:type="spellStart"/>
-      <w:r>
-        <w:rPr>
-          <w:rFonts w:ascii="Times New Roman" w:hAnsi="Times New Roman" w:cs="Times New Roman"/>
-        </w:rPr>
-        <w:t>Lupyan</w:t>
-      </w:r>
-      <w:proofErr w:type="spellEnd"/>
-      <w:r>
-        <w:rPr>
-          <w:rFonts w:ascii="Times New Roman" w:hAnsi="Times New Roman" w:cs="Times New Roman"/>
-        </w:rPr>
-        <w:t xml:space="preserve">, D.; Robinson, S.; Dahlgren, M. K.; Greenwood, J.; Romero, D. L.; Masse, C.; Knight, J. L.; Steinbrecher, T.; </w:t>
-      </w:r>
-      <w:proofErr w:type="spellStart"/>
-      <w:r>
-        <w:rPr>
-          <w:rFonts w:ascii="Times New Roman" w:hAnsi="Times New Roman" w:cs="Times New Roman"/>
-        </w:rPr>
-        <w:t>Beuming</w:t>
-      </w:r>
-      <w:proofErr w:type="spellEnd"/>
-      <w:r>
-        <w:rPr>
-          <w:rFonts w:ascii="Times New Roman" w:hAnsi="Times New Roman" w:cs="Times New Roman"/>
-        </w:rPr>
-        <w:t xml:space="preserve">, T.; Damm, W.; Harder, E.; Sherman, W.; Brewer, M.; Wester, R.; Murcko, M.; Frye, L.; Farid, R.; Lin, T.; Mobley, D. L.; Jorgensen, W. L.; Berne, B. J.; Friesner, R. A.; Abel, R. Accurate and Reliable Prediction of Relative Ligand Binding Potency in Prospective Drug Discovery by Way of a Modern Free-Energy Calculation Protocol and Force Field. </w:t>
+        <w:t xml:space="preserve">Wang, L.; Wu, Y.; Deng, Y.; Kim, B.; Pierce, L.; Krilov, G.; Lupyan, D.; Robinson, S.; Dahlgren, M. K.; Greenwood, J.; Romero, D. L.; Masse, C.; Knight, J. L.; Steinbrecher, T.; Beuming, T.; Damm, W.; Harder, E.; Sherman, W.; Brewer, M.; Wester, R.; Murcko, M.; Frye, L.; Farid, R.; Lin, T.; Mobley, D. L.; Jorgensen, W. L.; Berne, B. J.; Friesner, R. A.; Abel, R. Accurate and Reliable Prediction of Relative Ligand Binding Potency in Prospective Drug Discovery by Way of a Modern Free-Energy Calculation Protocol and Force Field. </w:t>
       </w:r>
       <w:r>
         <w:rPr>
@@ -25155,161 +23608,7 @@
           <w:rFonts w:ascii="Times New Roman" w:hAnsi="Times New Roman" w:cs="Times New Roman"/>
         </w:rPr>
         <w:tab/>
-        <w:t xml:space="preserve">Schindler, C. E. M.; Baumann, H.; Blum, A.; </w:t>
-      </w:r>
-      <w:proofErr w:type="spellStart"/>
-      <w:r>
-        <w:rPr>
-          <w:rFonts w:ascii="Times New Roman" w:hAnsi="Times New Roman" w:cs="Times New Roman"/>
-        </w:rPr>
-        <w:t>Böse</w:t>
-      </w:r>
-      <w:proofErr w:type="spellEnd"/>
-      <w:r>
-        <w:rPr>
-          <w:rFonts w:ascii="Times New Roman" w:hAnsi="Times New Roman" w:cs="Times New Roman"/>
-        </w:rPr>
-        <w:t xml:space="preserve">, D.; </w:t>
-      </w:r>
-      <w:proofErr w:type="spellStart"/>
-      <w:r>
-        <w:rPr>
-          <w:rFonts w:ascii="Times New Roman" w:hAnsi="Times New Roman" w:cs="Times New Roman"/>
-        </w:rPr>
-        <w:t>Buchstaller</w:t>
-      </w:r>
-      <w:proofErr w:type="spellEnd"/>
-      <w:r>
-        <w:rPr>
-          <w:rFonts w:ascii="Times New Roman" w:hAnsi="Times New Roman" w:cs="Times New Roman"/>
-        </w:rPr>
-        <w:t xml:space="preserve">, H.-P.; Burgdorf, L.; Cappel, D.; </w:t>
-      </w:r>
-      <w:proofErr w:type="spellStart"/>
-      <w:r>
-        <w:rPr>
-          <w:rFonts w:ascii="Times New Roman" w:hAnsi="Times New Roman" w:cs="Times New Roman"/>
-        </w:rPr>
-        <w:t>Chekler</w:t>
-      </w:r>
-      <w:proofErr w:type="spellEnd"/>
-      <w:r>
-        <w:rPr>
-          <w:rFonts w:ascii="Times New Roman" w:hAnsi="Times New Roman" w:cs="Times New Roman"/>
-        </w:rPr>
-        <w:t xml:space="preserve">, E.; </w:t>
-      </w:r>
-      <w:proofErr w:type="spellStart"/>
-      <w:r>
-        <w:rPr>
-          <w:rFonts w:ascii="Times New Roman" w:hAnsi="Times New Roman" w:cs="Times New Roman"/>
-        </w:rPr>
-        <w:t>Czodrowski</w:t>
-      </w:r>
-      <w:proofErr w:type="spellEnd"/>
-      <w:r>
-        <w:rPr>
-          <w:rFonts w:ascii="Times New Roman" w:hAnsi="Times New Roman" w:cs="Times New Roman"/>
-        </w:rPr>
-        <w:t xml:space="preserve">, P.; Dorsch, D.; </w:t>
-      </w:r>
-      <w:proofErr w:type="spellStart"/>
-      <w:r>
-        <w:rPr>
-          <w:rFonts w:ascii="Times New Roman" w:hAnsi="Times New Roman" w:cs="Times New Roman"/>
-        </w:rPr>
-        <w:t>Eguida</w:t>
-      </w:r>
-      <w:proofErr w:type="spellEnd"/>
-      <w:r>
-        <w:rPr>
-          <w:rFonts w:ascii="Times New Roman" w:hAnsi="Times New Roman" w:cs="Times New Roman"/>
-        </w:rPr>
-        <w:t xml:space="preserve">, M. K. I.; Follows, B.; </w:t>
-      </w:r>
-      <w:proofErr w:type="spellStart"/>
-      <w:r>
-        <w:rPr>
-          <w:rFonts w:ascii="Times New Roman" w:hAnsi="Times New Roman" w:cs="Times New Roman"/>
-        </w:rPr>
-        <w:t>Fuchß</w:t>
-      </w:r>
-      <w:proofErr w:type="spellEnd"/>
-      <w:r>
-        <w:rPr>
-          <w:rFonts w:ascii="Times New Roman" w:hAnsi="Times New Roman" w:cs="Times New Roman"/>
-        </w:rPr>
-        <w:t xml:space="preserve">, T.; </w:t>
-      </w:r>
-      <w:proofErr w:type="spellStart"/>
-      <w:r>
-        <w:rPr>
-          <w:rFonts w:ascii="Times New Roman" w:hAnsi="Times New Roman" w:cs="Times New Roman"/>
-        </w:rPr>
-        <w:t>Grädler</w:t>
-      </w:r>
-      <w:proofErr w:type="spellEnd"/>
-      <w:r>
-        <w:rPr>
-          <w:rFonts w:ascii="Times New Roman" w:hAnsi="Times New Roman" w:cs="Times New Roman"/>
-        </w:rPr>
-        <w:t xml:space="preserve">, U.; Gunera, J.; Johnson, T.; Jorand Lebrun, C.; Karra, S.; Klein, M.; Knehans, T.; </w:t>
-      </w:r>
-      <w:proofErr w:type="spellStart"/>
-      <w:r>
-        <w:rPr>
-          <w:rFonts w:ascii="Times New Roman" w:hAnsi="Times New Roman" w:cs="Times New Roman"/>
-        </w:rPr>
-        <w:t>Koetzner</w:t>
-      </w:r>
-      <w:proofErr w:type="spellEnd"/>
-      <w:r>
-        <w:rPr>
-          <w:rFonts w:ascii="Times New Roman" w:hAnsi="Times New Roman" w:cs="Times New Roman"/>
-        </w:rPr>
-        <w:t xml:space="preserve">, L.; Krier, M.; Leiendecker, M.; Leuthner, B.; Li, L.; </w:t>
-      </w:r>
-      <w:proofErr w:type="spellStart"/>
-      <w:r>
-        <w:rPr>
-          <w:rFonts w:ascii="Times New Roman" w:hAnsi="Times New Roman" w:cs="Times New Roman"/>
-        </w:rPr>
-        <w:t>Mochalkin</w:t>
-      </w:r>
-      <w:proofErr w:type="spellEnd"/>
-      <w:r>
-        <w:rPr>
-          <w:rFonts w:ascii="Times New Roman" w:hAnsi="Times New Roman" w:cs="Times New Roman"/>
-        </w:rPr>
-        <w:t xml:space="preserve">, I.; Musil, D.; Neagu, C.; Rippmann, F.; Schiemann, K.; Schulz, R.; Steinbrecher, T.; Tanzer, E.-M.; </w:t>
-      </w:r>
-      <w:proofErr w:type="spellStart"/>
-      <w:r>
-        <w:rPr>
-          <w:rFonts w:ascii="Times New Roman" w:hAnsi="Times New Roman" w:cs="Times New Roman"/>
-        </w:rPr>
-        <w:t>Unzue</w:t>
-      </w:r>
-      <w:proofErr w:type="spellEnd"/>
-      <w:r>
-        <w:rPr>
-          <w:rFonts w:ascii="Times New Roman" w:hAnsi="Times New Roman" w:cs="Times New Roman"/>
-        </w:rPr>
-        <w:t xml:space="preserve"> Lopez, A.; </w:t>
-      </w:r>
-      <w:proofErr w:type="spellStart"/>
-      <w:r>
-        <w:rPr>
-          <w:rFonts w:ascii="Times New Roman" w:hAnsi="Times New Roman" w:cs="Times New Roman"/>
-        </w:rPr>
-        <w:t>Viacava</w:t>
-      </w:r>
-      <w:proofErr w:type="spellEnd"/>
-      <w:r>
-        <w:rPr>
-          <w:rFonts w:ascii="Times New Roman" w:hAnsi="Times New Roman" w:cs="Times New Roman"/>
-        </w:rPr>
-        <w:t xml:space="preserve"> Follis, A.; Wegener, A.; Kuhn, D. Large-Scale Assessment of Binding Free Energy Calculations in Active Drug Discovery Projects. </w:t>
+        <w:t xml:space="preserve">Schindler, C. E. M.; Baumann, H.; Blum, A.; Böse, D.; Buchstaller, H.-P.; Burgdorf, L.; Cappel, D.; Chekler, E.; Czodrowski, P.; Dorsch, D.; Eguida, M. K. I.; Follows, B.; Fuchß, T.; Grädler, U.; Gunera, J.; Johnson, T.; Jorand Lebrun, C.; Karra, S.; Klein, M.; Knehans, T.; Koetzner, L.; Krier, M.; Leiendecker, M.; Leuthner, B.; Li, L.; Mochalkin, I.; Musil, D.; Neagu, C.; Rippmann, F.; Schiemann, K.; Schulz, R.; Steinbrecher, T.; Tanzer, E.-M.; Unzue Lopez, A.; Viacava Follis, A.; Wegener, A.; Kuhn, D. Large-Scale Assessment of Binding Free Energy Calculations in Active Drug Discovery Projects. </w:t>
       </w:r>
       <w:r>
         <w:rPr>
@@ -25435,21 +23734,7 @@
           <w:rFonts w:ascii="Times New Roman" w:hAnsi="Times New Roman" w:cs="Times New Roman"/>
         </w:rPr>
         <w:tab/>
-        <w:t xml:space="preserve">Taguchi, M.; Oyama, R.; </w:t>
-      </w:r>
-      <w:proofErr w:type="spellStart"/>
-      <w:r>
-        <w:rPr>
-          <w:rFonts w:ascii="Times New Roman" w:hAnsi="Times New Roman" w:cs="Times New Roman"/>
-        </w:rPr>
-        <w:t>Kaneso</w:t>
-      </w:r>
-      <w:proofErr w:type="spellEnd"/>
-      <w:r>
-        <w:rPr>
-          <w:rFonts w:ascii="Times New Roman" w:hAnsi="Times New Roman" w:cs="Times New Roman"/>
-        </w:rPr>
-        <w:t xml:space="preserve">, M.; Hayashi, S. Hybrid QM/MM Free-Energy Evaluation of Drug-Resistant Mutational Effect on the Binding of an Inhibitor Indinavir to HIV‑1 Protease. </w:t>
+        <w:t xml:space="preserve">Taguchi, M.; Oyama, R.; Kaneso, M.; Hayashi, S. Hybrid QM/MM Free-Energy Evaluation of Drug-Resistant Mutational Effect on the Binding of an Inhibitor Indinavir to HIV‑1 Protease. </w:t>
       </w:r>
       <w:r>
         <w:rPr>
@@ -25575,21 +23860,7 @@
           <w:rFonts w:ascii="Times New Roman" w:hAnsi="Times New Roman" w:cs="Times New Roman"/>
         </w:rPr>
         <w:tab/>
-        <w:t xml:space="preserve">Tiwary, P.; Limongelli, V.; </w:t>
-      </w:r>
-      <w:proofErr w:type="spellStart"/>
-      <w:r>
-        <w:rPr>
-          <w:rFonts w:ascii="Times New Roman" w:hAnsi="Times New Roman" w:cs="Times New Roman"/>
-        </w:rPr>
-        <w:t>Salvalaglio</w:t>
-      </w:r>
-      <w:proofErr w:type="spellEnd"/>
-      <w:r>
-        <w:rPr>
-          <w:rFonts w:ascii="Times New Roman" w:hAnsi="Times New Roman" w:cs="Times New Roman"/>
-        </w:rPr>
-        <w:t xml:space="preserve">, M.; Parrinello, M. Kinetics of Protein–Ligand Unbinding: Predicting Pathways, Rates, and Rate-Limiting Steps. </w:t>
+        <w:t xml:space="preserve">Tiwary, P.; Limongelli, V.; Salvalaglio, M.; Parrinello, M. Kinetics of Protein–Ligand Unbinding: Predicting Pathways, Rates, and Rate-Limiting Steps. </w:t>
       </w:r>
       <w:r>
         <w:rPr>
@@ -25652,21 +23923,7 @@
           <w:rFonts w:ascii="Times New Roman" w:hAnsi="Times New Roman" w:cs="Times New Roman"/>
         </w:rPr>
         <w:tab/>
-        <w:t xml:space="preserve">Jagger, B. R.; Ojha, A. A.; Amaro, R. E. Predicting Ligand Binding Kinetics Using a Markovian </w:t>
-      </w:r>
-      <w:proofErr w:type="spellStart"/>
-      <w:r>
-        <w:rPr>
-          <w:rFonts w:ascii="Times New Roman" w:hAnsi="Times New Roman" w:cs="Times New Roman"/>
-        </w:rPr>
-        <w:t>Milestoning</w:t>
-      </w:r>
-      <w:proofErr w:type="spellEnd"/>
-      <w:r>
-        <w:rPr>
-          <w:rFonts w:ascii="Times New Roman" w:hAnsi="Times New Roman" w:cs="Times New Roman"/>
-        </w:rPr>
-        <w:t xml:space="preserve"> with Voronoi Tessellations Multiscale Approach. </w:t>
+        <w:t xml:space="preserve">Jagger, B. R.; Ojha, A. A.; Amaro, R. E. Predicting Ligand Binding Kinetics Using a Markovian Milestoning with Voronoi Tessellations Multiscale Approach. </w:t>
       </w:r>
       <w:r>
         <w:rPr>
@@ -25674,25 +23931,7 @@
           <w:i/>
           <w:iCs/>
         </w:rPr>
-        <w:t xml:space="preserve">J. Chem. Theory </w:t>
-      </w:r>
-      <w:proofErr w:type="spellStart"/>
-      <w:r>
-        <w:rPr>
-          <w:rFonts w:ascii="Times New Roman" w:hAnsi="Times New Roman" w:cs="Times New Roman"/>
-          <w:i/>
-          <w:iCs/>
-        </w:rPr>
-        <w:t>Comput</w:t>
-      </w:r>
-      <w:proofErr w:type="spellEnd"/>
-      <w:r>
-        <w:rPr>
-          <w:rFonts w:ascii="Times New Roman" w:hAnsi="Times New Roman" w:cs="Times New Roman"/>
-          <w:i/>
-          <w:iCs/>
-        </w:rPr>
-        <w:t>.</w:t>
+        <w:t>J. Chem. Theory Comput.</w:t>
       </w:r>
       <w:r>
         <w:rPr>
@@ -25748,35 +23987,7 @@
           <w:rFonts w:ascii="Times New Roman" w:hAnsi="Times New Roman" w:cs="Times New Roman"/>
         </w:rPr>
         <w:tab/>
-        <w:t xml:space="preserve">Corso, G.; </w:t>
-      </w:r>
-      <w:proofErr w:type="spellStart"/>
-      <w:r>
-        <w:rPr>
-          <w:rFonts w:ascii="Times New Roman" w:hAnsi="Times New Roman" w:cs="Times New Roman"/>
-        </w:rPr>
-        <w:t>Stärk</w:t>
-      </w:r>
-      <w:proofErr w:type="spellEnd"/>
-      <w:r>
-        <w:rPr>
-          <w:rFonts w:ascii="Times New Roman" w:hAnsi="Times New Roman" w:cs="Times New Roman"/>
-        </w:rPr>
-        <w:t xml:space="preserve">, H.; Jing, B.; Barzilay, R.; Jaakkola, T. </w:t>
-      </w:r>
-      <w:proofErr w:type="spellStart"/>
-      <w:r>
-        <w:rPr>
-          <w:rFonts w:ascii="Times New Roman" w:hAnsi="Times New Roman" w:cs="Times New Roman"/>
-        </w:rPr>
-        <w:t>DiffDock</w:t>
-      </w:r>
-      <w:proofErr w:type="spellEnd"/>
-      <w:r>
-        <w:rPr>
-          <w:rFonts w:ascii="Times New Roman" w:hAnsi="Times New Roman" w:cs="Times New Roman"/>
-        </w:rPr>
-        <w:t>: Diffusion Steps, Twists, and Turns for Molecular Docking. arXiv February 11, 2023. https://doi.org/10.48550/arXiv.2210.01776.</w:t>
+        <w:t>Corso, G.; Stärk, H.; Jing, B.; Barzilay, R.; Jaakkola, T. DiffDock: Diffusion Steps, Twists, and Turns for Molecular Docking. arXiv February 11, 2023. https://doi.org/10.48550/arXiv.2210.01776.</w:t>
       </w:r>
     </w:p>
     <w:p>
@@ -25797,35 +24008,7 @@
           <w:rFonts w:ascii="Times New Roman" w:hAnsi="Times New Roman" w:cs="Times New Roman"/>
         </w:rPr>
         <w:tab/>
-        <w:t xml:space="preserve">Wohlwend, J.; Corso, G.; Passaro, S.; Getz, N.; Reveiz, M.; Leidal, K.; Swiderski, W.; Atkinson, L.; </w:t>
-      </w:r>
-      <w:proofErr w:type="spellStart"/>
-      <w:r>
-        <w:rPr>
-          <w:rFonts w:ascii="Times New Roman" w:hAnsi="Times New Roman" w:cs="Times New Roman"/>
-        </w:rPr>
-        <w:t>Portnoi</w:t>
-      </w:r>
-      <w:proofErr w:type="spellEnd"/>
-      <w:r>
-        <w:rPr>
-          <w:rFonts w:ascii="Times New Roman" w:hAnsi="Times New Roman" w:cs="Times New Roman"/>
-        </w:rPr>
-        <w:t xml:space="preserve">, T.; Chinn, I.; </w:t>
-      </w:r>
-      <w:proofErr w:type="spellStart"/>
-      <w:r>
-        <w:rPr>
-          <w:rFonts w:ascii="Times New Roman" w:hAnsi="Times New Roman" w:cs="Times New Roman"/>
-        </w:rPr>
-        <w:t>Silterra</w:t>
-      </w:r>
-      <w:proofErr w:type="spellEnd"/>
-      <w:r>
-        <w:rPr>
-          <w:rFonts w:ascii="Times New Roman" w:hAnsi="Times New Roman" w:cs="Times New Roman"/>
-        </w:rPr>
-        <w:t>, J.; Jaakkola, T.; Barzilay, R. Boltz-1 Democratizing Biomolecular Interaction Modeling. bioRxiv May 6, 2025, p 2024.11.19.624167. https://doi.org/10.1101/2024.11.19.624167.</w:t>
+        <w:t>Wohlwend, J.; Corso, G.; Passaro, S.; Getz, N.; Reveiz, M.; Leidal, K.; Swiderski, W.; Atkinson, L.; Portnoi, T.; Chinn, I.; Silterra, J.; Jaakkola, T.; Barzilay, R. Boltz-1 Democratizing Biomolecular Interaction Modeling. bioRxiv May 6, 2025, p 2024.11.19.624167. https://doi.org/10.1101/2024.11.19.624167.</w:t>
       </w:r>
     </w:p>
     <w:p>
@@ -25846,49 +24029,7 @@
           <w:rFonts w:ascii="Times New Roman" w:hAnsi="Times New Roman" w:cs="Times New Roman"/>
         </w:rPr>
         <w:tab/>
-        <w:t xml:space="preserve">Passaro, S.; Corso, G.; Wohlwend, J.; Reveiz, M.; Thaler, S.; Somnath, V. R.; Getz, N.; </w:t>
-      </w:r>
-      <w:proofErr w:type="spellStart"/>
-      <w:r>
-        <w:rPr>
-          <w:rFonts w:ascii="Times New Roman" w:hAnsi="Times New Roman" w:cs="Times New Roman"/>
-        </w:rPr>
-        <w:t>Portnoi</w:t>
-      </w:r>
-      <w:proofErr w:type="spellEnd"/>
-      <w:r>
-        <w:rPr>
-          <w:rFonts w:ascii="Times New Roman" w:hAnsi="Times New Roman" w:cs="Times New Roman"/>
-        </w:rPr>
-        <w:t xml:space="preserve">, T.; Roy, J.; Stark, H.; </w:t>
-      </w:r>
-      <w:proofErr w:type="spellStart"/>
-      <w:r>
-        <w:rPr>
-          <w:rFonts w:ascii="Times New Roman" w:hAnsi="Times New Roman" w:cs="Times New Roman"/>
-        </w:rPr>
-        <w:t>Kwabi</w:t>
-      </w:r>
-      <w:proofErr w:type="spellEnd"/>
-      <w:r>
-        <w:rPr>
-          <w:rFonts w:ascii="Times New Roman" w:hAnsi="Times New Roman" w:cs="Times New Roman"/>
-        </w:rPr>
-        <w:t xml:space="preserve">-Addo, D.; </w:t>
-      </w:r>
-      <w:proofErr w:type="spellStart"/>
-      <w:r>
-        <w:rPr>
-          <w:rFonts w:ascii="Times New Roman" w:hAnsi="Times New Roman" w:cs="Times New Roman"/>
-        </w:rPr>
-        <w:t>Beaini</w:t>
-      </w:r>
-      <w:proofErr w:type="spellEnd"/>
-      <w:r>
-        <w:rPr>
-          <w:rFonts w:ascii="Times New Roman" w:hAnsi="Times New Roman" w:cs="Times New Roman"/>
-        </w:rPr>
-        <w:t>, D.; Jaakkola, T.; Barzilay, R. Boltz-2: Towards Accurate and Efficient Binding Affinity Prediction. bioRxiv June 18, 2025, p 2025.06.14.659707. https://doi.org/10.1101/2025.06.14.659707.</w:t>
+        <w:t>Passaro, S.; Corso, G.; Wohlwend, J.; Reveiz, M.; Thaler, S.; Somnath, V. R.; Getz, N.; Portnoi, T.; Roy, J.; Stark, H.; Kwabi-Addo, D.; Beaini, D.; Jaakkola, T.; Barzilay, R. Boltz-2: Towards Accurate and Efficient Binding Affinity Prediction. bioRxiv June 18, 2025, p 2025.06.14.659707. https://doi.org/10.1101/2025.06.14.659707.</w:t>
       </w:r>
     </w:p>
     <w:p>
@@ -26700,6 +24841,7 @@
   <w:style w:type="character" w:default="1" w:styleId="DefaultParagraphFont">
     <w:name w:val="Default Paragraph Font"/>
     <w:uiPriority w:val="1"/>
+    <w:semiHidden/>
     <w:unhideWhenUsed/>
   </w:style>
   <w:style w:type="table" w:default="1" w:styleId="TableNormal">

</xml_diff>